<commit_message>
Accept a lower grade from the same test; validation of promotion/demotion policy
- If the claimed grade is not confirmed but the test shows P(theta >= lower bound
  of the grade below) >= 0.8, the candidate can accept that grade right away
  (POST /testing/sessions/{token}/accept-suggested); domain scores are rescaled
  to the accepted grade. Validation: offered in 73.3% of non-confirmations,
  correct in 99.8%.
- Promotion from the same test stays disabled: a strong result would be right in
  only 72.9% of cases, so the next level needs its own test (opened immediately).
- Retest buttons keep the resume of the session; grade names localized.
- Docs, README, presentation and validation reports updated.
</commit_message>
<xml_diff>
--- a/docs/fsp-career-documentation.docx
+++ b/docs/fsp-career-documentation.docx
@@ -5339,7 +5339,7 @@
                 <w:sz w:val="17"/>
                 <w:szCs w:val="17"/>
               </w:rPr>
-              <w:t xml:space="preserve">91 эндпоинт в Swagger; </w:t>
+              <w:t xml:space="preserve">92 эндпоинта в Swagger; </w:t>
             </w:r>
             <w:r>
               <w:rPr>
@@ -11646,7 +11646,7 @@
           <w:sz w:val="20"/>
           <w:szCs w:val="20"/>
         </w:rPr>
-        <w:t xml:space="preserve">Бэкенд не хранит состояние между запросами (сессии теста — в БД, токены — JWT), поэтому масштабируется репликами за балансировщиком. Подборка по пулу до 900 кандидатов ранжируется в среднем за 40 мс (p95 — 64 мс); полный запрос «текст потребности → подборка» в Docker-стенде на 700 кандидатах выполняется за 0,1–0,2 с. Тяжёлые объекты (модель классификации специализаций, NER-модель Natasha, индекс детектора «чужих вариантов») загружаются при старте в фоновом потоке. Фронтенд разделён на ленивые чанки по маршрутам: основной бандл — около 430 КБ.</w:t>
+        <w:t xml:space="preserve">Бэкенд не хранит состояние между запросами (сессии теста — в БД, токены — JWT), поэтому масштабируется репликами за балансировщиком. Подборка по пулу до 900 кандидатов ранжируется в среднем за 40 мс (p95 — 67 мс); полный запрос «текст потребности → подборка» в Docker-стенде на 700 кандидатах выполняется за 0,1–0,2 с. Тяжёлые объекты (модель классификации специализаций, NER-модель Natasha, индекс детектора «чужих вариантов») загружаются при старте в фоновом потоке. Фронтенд разделён на ленивые чанки по маршрутам: основной бандл — около 430 КБ.</w:t>
       </w:r>
     </w:p>
     <w:p>
@@ -13441,6 +13441,60 @@
           <w:sz w:val="20"/>
           <w:szCs w:val="20"/>
         </w:rPr>
+        <w:t xml:space="preserve">грейд ниже заявленного можно </w:t>
+      </w:r>
+      <w:r>
+        <w:rPr>
+          <w:b/>
+          <w:bCs/>
+          <w:color w:val="1C1D22"/>
+          <w:sz w:val="20"/>
+          <w:szCs w:val="20"/>
+        </w:rPr>
+        <w:t xml:space="preserve">принять по тому же тесту</w:t>
+      </w:r>
+      <w:r>
+        <w:rPr>
+          <w:color w:val="1C1D22"/>
+          <w:sz w:val="20"/>
+          <w:szCs w:val="20"/>
+        </w:rPr>
+        <w:t xml:space="preserve">, без повторного прохождения, если тест с вероятностью ≥ 0,8 показал уровень не ниже этого грейда: на валидации такое предложение получают 73% неподтвердивших, и оно верно в 99,8% случаев. </w:t>
+      </w:r>
+      <w:r>
+        <w:rPr>
+          <w:b/>
+          <w:bCs/>
+          <w:color w:val="1C1D22"/>
+          <w:sz w:val="20"/>
+          <w:szCs w:val="20"/>
+        </w:rPr>
+        <w:t xml:space="preserve">Повысить</w:t>
+      </w:r>
+      <w:r>
+        <w:rPr>
+          <w:color w:val="1C1D22"/>
+          <w:sz w:val="20"/>
+          <w:szCs w:val="20"/>
+        </w:rPr>
+        <w:t xml:space="preserve"> грейд по тому же тесту нельзя: если бы «уверенный» результат сразу давал следующий грейд, он был бы верен лишь в 73% случаев (ошибка «завысили» дороже для работодателя), поэтому следующий уровень подтверждается отдельным тестом — он открывается сразу, без ожидания;</w:t>
+      </w:r>
+    </w:p>
+    <w:p>
+      <w:pPr>
+        <w:pStyle w:val="ListParagraph"/>
+        <w:numPr>
+          <w:ilvl w:val="0"/>
+          <w:numId w:val="2"/>
+        </w:numPr>
+        <w:spacing w:after="70" w:line="280"/>
+      </w:pPr>
+      <w:r>
+        <w:rPr>
+          <w:color w:val="1C1D22"/>
+          <w:sz w:val="20"/>
+          <w:szCs w:val="20"/>
+        </w:rPr>
         <w:t xml:space="preserve">смена грейда — не чаще одного раза в 90 дней; повторная попытка того же уровня — через 30 дней; уверенно подтвердивший уровень может сразу пробовать следующий;</w:t>
       </w:r>
     </w:p>
@@ -16855,8 +16909,8 @@
         </w:tblBorders>
       </w:tblPr>
       <w:tblGrid>
-        <w:gridCol w:w="4219"/>
-        <w:gridCol w:w="5419"/>
+        <w:gridCol w:w="4297"/>
+        <w:gridCol w:w="5341"/>
       </w:tblGrid>
       <w:tr>
         <w:trPr>
@@ -16865,7 +16919,7 @@
         </w:trPr>
         <w:tc>
           <w:tcPr>
-            <w:tcW w:type="dxa" w:w="4219"/>
+            <w:tcW w:type="dxa" w:w="4297"/>
             <w:tcBorders>
               <w:top w:val="single" w:color="DDD8EA" w:sz="4"/>
               <w:left w:val="single" w:color="DDD8EA" w:sz="4"/>
@@ -16899,7 +16953,7 @@
         </w:tc>
         <w:tc>
           <w:tcPr>
-            <w:tcW w:type="dxa" w:w="5419"/>
+            <w:tcW w:type="dxa" w:w="5341"/>
             <w:tcBorders>
               <w:top w:val="single" w:color="DDD8EA" w:sz="4"/>
               <w:left w:val="single" w:color="DDD8EA" w:sz="4"/>
@@ -16939,7 +16993,7 @@
         </w:trPr>
         <w:tc>
           <w:tcPr>
-            <w:tcW w:type="dxa" w:w="4219"/>
+            <w:tcW w:type="dxa" w:w="4297"/>
             <w:tcBorders>
               <w:top w:val="single" w:color="DDD8EA" w:sz="4"/>
               <w:left w:val="single" w:color="DDD8EA" w:sz="4"/>
@@ -16970,7 +17024,7 @@
         </w:tc>
         <w:tc>
           <w:tcPr>
-            <w:tcW w:type="dxa" w:w="5419"/>
+            <w:tcW w:type="dxa" w:w="5341"/>
             <w:tcBorders>
               <w:top w:val="single" w:color="DDD8EA" w:sz="4"/>
               <w:left w:val="single" w:color="DDD8EA" w:sz="4"/>
@@ -17007,7 +17061,7 @@
         </w:trPr>
         <w:tc>
           <w:tcPr>
-            <w:tcW w:type="dxa" w:w="4219"/>
+            <w:tcW w:type="dxa" w:w="4297"/>
             <w:tcBorders>
               <w:top w:val="single" w:color="DDD8EA" w:sz="4"/>
               <w:left w:val="single" w:color="DDD8EA" w:sz="4"/>
@@ -17039,7 +17093,7 @@
         </w:tc>
         <w:tc>
           <w:tcPr>
-            <w:tcW w:type="dxa" w:w="5419"/>
+            <w:tcW w:type="dxa" w:w="5341"/>
             <w:tcBorders>
               <w:top w:val="single" w:color="DDD8EA" w:sz="4"/>
               <w:left w:val="single" w:color="DDD8EA" w:sz="4"/>
@@ -17077,7 +17131,7 @@
         </w:trPr>
         <w:tc>
           <w:tcPr>
-            <w:tcW w:type="dxa" w:w="4219"/>
+            <w:tcW w:type="dxa" w:w="4297"/>
             <w:tcBorders>
               <w:top w:val="single" w:color="DDD8EA" w:sz="4"/>
               <w:left w:val="single" w:color="DDD8EA" w:sz="4"/>
@@ -17108,7 +17162,7 @@
         </w:tc>
         <w:tc>
           <w:tcPr>
-            <w:tcW w:type="dxa" w:w="5419"/>
+            <w:tcW w:type="dxa" w:w="5341"/>
             <w:tcBorders>
               <w:top w:val="single" w:color="DDD8EA" w:sz="4"/>
               <w:left w:val="single" w:color="DDD8EA" w:sz="4"/>
@@ -17145,7 +17199,7 @@
         </w:trPr>
         <w:tc>
           <w:tcPr>
-            <w:tcW w:type="dxa" w:w="4219"/>
+            <w:tcW w:type="dxa" w:w="4297"/>
             <w:tcBorders>
               <w:top w:val="single" w:color="DDD8EA" w:sz="4"/>
               <w:left w:val="single" w:color="DDD8EA" w:sz="4"/>
@@ -17177,7 +17231,7 @@
         </w:tc>
         <w:tc>
           <w:tcPr>
-            <w:tcW w:type="dxa" w:w="5419"/>
+            <w:tcW w:type="dxa" w:w="5341"/>
             <w:tcBorders>
               <w:top w:val="single" w:color="DDD8EA" w:sz="4"/>
               <w:left w:val="single" w:color="DDD8EA" w:sz="4"/>
@@ -17215,7 +17269,7 @@
         </w:trPr>
         <w:tc>
           <w:tcPr>
-            <w:tcW w:type="dxa" w:w="4219"/>
+            <w:tcW w:type="dxa" w:w="4297"/>
             <w:tcBorders>
               <w:top w:val="single" w:color="DDD8EA" w:sz="4"/>
               <w:left w:val="single" w:color="DDD8EA" w:sz="4"/>
@@ -17246,7 +17300,7 @@
         </w:tc>
         <w:tc>
           <w:tcPr>
-            <w:tcW w:type="dxa" w:w="5419"/>
+            <w:tcW w:type="dxa" w:w="5341"/>
             <w:tcBorders>
               <w:top w:val="single" w:color="DDD8EA" w:sz="4"/>
               <w:left w:val="single" w:color="DDD8EA" w:sz="4"/>
@@ -17283,7 +17337,7 @@
         </w:trPr>
         <w:tc>
           <w:tcPr>
-            <w:tcW w:type="dxa" w:w="4219"/>
+            <w:tcW w:type="dxa" w:w="4297"/>
             <w:tcBorders>
               <w:top w:val="single" w:color="DDD8EA" w:sz="4"/>
               <w:left w:val="single" w:color="DDD8EA" w:sz="4"/>
@@ -17315,7 +17369,7 @@
         </w:tc>
         <w:tc>
           <w:tcPr>
-            <w:tcW w:type="dxa" w:w="5419"/>
+            <w:tcW w:type="dxa" w:w="5341"/>
             <w:tcBorders>
               <w:top w:val="single" w:color="DDD8EA" w:sz="4"/>
               <w:left w:val="single" w:color="DDD8EA" w:sz="4"/>
@@ -17353,7 +17407,7 @@
         </w:trPr>
         <w:tc>
           <w:tcPr>
-            <w:tcW w:type="dxa" w:w="4219"/>
+            <w:tcW w:type="dxa" w:w="4297"/>
             <w:tcBorders>
               <w:top w:val="single" w:color="DDD8EA" w:sz="4"/>
               <w:left w:val="single" w:color="DDD8EA" w:sz="4"/>
@@ -17384,7 +17438,7 @@
         </w:tc>
         <w:tc>
           <w:tcPr>
-            <w:tcW w:type="dxa" w:w="5419"/>
+            <w:tcW w:type="dxa" w:w="5341"/>
             <w:tcBorders>
               <w:top w:val="single" w:color="DDD8EA" w:sz="4"/>
               <w:left w:val="single" w:color="DDD8EA" w:sz="4"/>
@@ -17421,7 +17475,7 @@
         </w:trPr>
         <w:tc>
           <w:tcPr>
-            <w:tcW w:type="dxa" w:w="4219"/>
+            <w:tcW w:type="dxa" w:w="4297"/>
             <w:tcBorders>
               <w:top w:val="single" w:color="DDD8EA" w:sz="4"/>
               <w:left w:val="single" w:color="DDD8EA" w:sz="4"/>
@@ -17447,13 +17501,13 @@
                 <w:sz w:val="17"/>
                 <w:szCs w:val="17"/>
               </w:rPr>
-              <w:t xml:space="preserve">Дискриминативность: медиана индекса D / доля заданий с D ≥ 0,3</w:t>
-            </w:r>
-          </w:p>
-        </w:tc>
-        <w:tc>
-          <w:tcPr>
-            <w:tcW w:type="dxa" w:w="5419"/>
+              <w:t xml:space="preserve">Грейд ниже по тому же тесту (P ≥ 0,8): предлагается / верно</w:t>
+            </w:r>
+          </w:p>
+        </w:tc>
+        <w:tc>
+          <w:tcPr>
+            <w:tcW w:type="dxa" w:w="5341"/>
             <w:tcBorders>
               <w:top w:val="single" w:color="DDD8EA" w:sz="4"/>
               <w:left w:val="single" w:color="DDD8EA" w:sz="4"/>
@@ -17479,7 +17533,7 @@
                 <w:sz w:val="17"/>
                 <w:szCs w:val="17"/>
               </w:rPr>
-              <w:t xml:space="preserve">0,42 / 81,9% (D &lt; 0,2 — 3,6%)</w:t>
+              <w:t xml:space="preserve">73,3% неподтверждений / 99,8%</w:t>
             </w:r>
           </w:p>
         </w:tc>
@@ -17491,7 +17545,7 @@
         </w:trPr>
         <w:tc>
           <w:tcPr>
-            <w:tcW w:type="dxa" w:w="4219"/>
+            <w:tcW w:type="dxa" w:w="4297"/>
             <w:tcBorders>
               <w:top w:val="single" w:color="DDD8EA" w:sz="4"/>
               <w:left w:val="single" w:color="DDD8EA" w:sz="4"/>
@@ -17516,13 +17570,13 @@
                 <w:sz w:val="17"/>
                 <w:szCs w:val="17"/>
               </w:rPr>
-              <w:t xml:space="preserve">Медиана точечно-бисериальной корреляции</w:t>
-            </w:r>
-          </w:p>
-        </w:tc>
-        <w:tc>
-          <w:tcPr>
-            <w:tcW w:type="dxa" w:w="5419"/>
+              <w:t xml:space="preserve">Если бы «уверенный» результат сразу повышал грейд: верно</w:t>
+            </w:r>
+          </w:p>
+        </w:tc>
+        <w:tc>
+          <w:tcPr>
+            <w:tcW w:type="dxa" w:w="5341"/>
             <w:tcBorders>
               <w:top w:val="single" w:color="DDD8EA" w:sz="4"/>
               <w:left w:val="single" w:color="DDD8EA" w:sz="4"/>
@@ -17547,7 +17601,7 @@
                 <w:sz w:val="17"/>
                 <w:szCs w:val="17"/>
               </w:rPr>
-              <w:t xml:space="preserve">0,355 (параметрические семейства — D = 0,568, статичные — 0,37)</w:t>
+              <w:t xml:space="preserve">72,9% (48 сессий) — поэтому повышение только отдельным тестом</w:t>
             </w:r>
           </w:p>
         </w:tc>
@@ -17559,7 +17613,7 @@
         </w:trPr>
         <w:tc>
           <w:tcPr>
-            <w:tcW w:type="dxa" w:w="4219"/>
+            <w:tcW w:type="dxa" w:w="4297"/>
             <w:tcBorders>
               <w:top w:val="single" w:color="DDD8EA" w:sz="4"/>
               <w:left w:val="single" w:color="DDD8EA" w:sz="4"/>
@@ -17585,13 +17639,151 @@
                 <w:sz w:val="17"/>
                 <w:szCs w:val="17"/>
               </w:rPr>
+              <w:t xml:space="preserve">Дискриминативность: медиана индекса D / доля заданий с D ≥ 0,3</w:t>
+            </w:r>
+          </w:p>
+        </w:tc>
+        <w:tc>
+          <w:tcPr>
+            <w:tcW w:type="dxa" w:w="5341"/>
+            <w:tcBorders>
+              <w:top w:val="single" w:color="DDD8EA" w:sz="4"/>
+              <w:left w:val="single" w:color="DDD8EA" w:sz="4"/>
+              <w:bottom w:val="single" w:color="DDD8EA" w:sz="4"/>
+              <w:right w:val="single" w:color="DDD8EA" w:sz="4"/>
+            </w:tcBorders>
+            <w:shd w:fill="F6F4FA" w:color="auto" w:val="clear"/>
+            <w:tcMar>
+              <w:top w:type="dxa" w:w="50"/>
+              <w:left w:type="dxa" w:w="90"/>
+              <w:bottom w:type="dxa" w:w="50"/>
+              <w:right w:type="dxa" w:w="90"/>
+            </w:tcMar>
+            <w:vAlign w:val="center"/>
+          </w:tcPr>
+          <w:p>
+            <w:pPr>
+              <w:spacing w:after="0" w:line="250"/>
+            </w:pPr>
+            <w:r>
+              <w:rPr>
+                <w:color w:val="1C1D22"/>
+                <w:sz w:val="17"/>
+                <w:szCs w:val="17"/>
+              </w:rPr>
+              <w:t xml:space="preserve">0,42 / 81,9% (D &lt; 0,2 — 3,6%)</w:t>
+            </w:r>
+          </w:p>
+        </w:tc>
+      </w:tr>
+      <w:tr>
+        <w:trPr>
+          <w:cantSplit/>
+          <w:tblHeader w:val="off"/>
+        </w:trPr>
+        <w:tc>
+          <w:tcPr>
+            <w:tcW w:type="dxa" w:w="4297"/>
+            <w:tcBorders>
+              <w:top w:val="single" w:color="DDD8EA" w:sz="4"/>
+              <w:left w:val="single" w:color="DDD8EA" w:sz="4"/>
+              <w:bottom w:val="single" w:color="DDD8EA" w:sz="4"/>
+              <w:right w:val="single" w:color="DDD8EA" w:sz="4"/>
+            </w:tcBorders>
+            <w:tcMar>
+              <w:top w:type="dxa" w:w="50"/>
+              <w:left w:type="dxa" w:w="90"/>
+              <w:bottom w:type="dxa" w:w="50"/>
+              <w:right w:type="dxa" w:w="90"/>
+            </w:tcMar>
+            <w:vAlign w:val="center"/>
+          </w:tcPr>
+          <w:p>
+            <w:pPr>
+              <w:spacing w:after="0" w:line="250"/>
+            </w:pPr>
+            <w:r>
+              <w:rPr>
+                <w:color w:val="1C1D22"/>
+                <w:sz w:val="17"/>
+                <w:szCs w:val="17"/>
+              </w:rPr>
+              <w:t xml:space="preserve">Медиана точечно-бисериальной корреляции</w:t>
+            </w:r>
+          </w:p>
+        </w:tc>
+        <w:tc>
+          <w:tcPr>
+            <w:tcW w:type="dxa" w:w="5341"/>
+            <w:tcBorders>
+              <w:top w:val="single" w:color="DDD8EA" w:sz="4"/>
+              <w:left w:val="single" w:color="DDD8EA" w:sz="4"/>
+              <w:bottom w:val="single" w:color="DDD8EA" w:sz="4"/>
+              <w:right w:val="single" w:color="DDD8EA" w:sz="4"/>
+            </w:tcBorders>
+            <w:tcMar>
+              <w:top w:type="dxa" w:w="50"/>
+              <w:left w:type="dxa" w:w="90"/>
+              <w:bottom w:type="dxa" w:w="50"/>
+              <w:right w:type="dxa" w:w="90"/>
+            </w:tcMar>
+            <w:vAlign w:val="center"/>
+          </w:tcPr>
+          <w:p>
+            <w:pPr>
+              <w:spacing w:after="0" w:line="250"/>
+            </w:pPr>
+            <w:r>
+              <w:rPr>
+                <w:color w:val="1C1D22"/>
+                <w:sz w:val="17"/>
+                <w:szCs w:val="17"/>
+              </w:rPr>
+              <w:t xml:space="preserve">0,355 (параметрические семейства — D = 0,568, статичные — 0,37)</w:t>
+            </w:r>
+          </w:p>
+        </w:tc>
+      </w:tr>
+      <w:tr>
+        <w:trPr>
+          <w:cantSplit/>
+          <w:tblHeader w:val="off"/>
+        </w:trPr>
+        <w:tc>
+          <w:tcPr>
+            <w:tcW w:type="dxa" w:w="4297"/>
+            <w:tcBorders>
+              <w:top w:val="single" w:color="DDD8EA" w:sz="4"/>
+              <w:left w:val="single" w:color="DDD8EA" w:sz="4"/>
+              <w:bottom w:val="single" w:color="DDD8EA" w:sz="4"/>
+              <w:right w:val="single" w:color="DDD8EA" w:sz="4"/>
+            </w:tcBorders>
+            <w:shd w:fill="F6F4FA" w:color="auto" w:val="clear"/>
+            <w:tcMar>
+              <w:top w:type="dxa" w:w="50"/>
+              <w:left w:type="dxa" w:w="90"/>
+              <w:bottom w:type="dxa" w:w="50"/>
+              <w:right w:type="dxa" w:w="90"/>
+            </w:tcMar>
+            <w:vAlign w:val="center"/>
+          </w:tcPr>
+          <w:p>
+            <w:pPr>
+              <w:spacing w:after="0" w:line="250"/>
+            </w:pPr>
+            <w:r>
+              <w:rPr>
+                <w:color w:val="1C1D22"/>
+                <w:sz w:val="17"/>
+                <w:szCs w:val="17"/>
+              </w:rPr>
               <w:t xml:space="preserve">Сдвиг оценки по языкам кода (Backend)</w:t>
             </w:r>
           </w:p>
         </w:tc>
         <w:tc>
           <w:tcPr>
-            <w:tcW w:type="dxa" w:w="5419"/>
+            <w:tcW w:type="dxa" w:w="5341"/>
             <w:tcBorders>
               <w:top w:val="single" w:color="DDD8EA" w:sz="4"/>
               <w:left w:val="single" w:color="DDD8EA" w:sz="4"/>
@@ -21865,7 +22057,7 @@
           <w:sz w:val="20"/>
           <w:szCs w:val="20"/>
         </w:rPr>
-        <w:t xml:space="preserve">среднее время ранжирования пула до 900 кандидатов — 40 мс (p95 — 64 мс).</w:t>
+        <w:t xml:space="preserve">среднее время ранжирования пула до 900 кандидатов — 40 мс (p95 — 67 мс).</w:t>
       </w:r>
     </w:p>
     <w:p>
@@ -31388,7 +31580,7 @@
                 <w:sz w:val="15"/>
                 <w:szCs w:val="15"/>
               </w:rPr>
-              <w:t xml:space="preserve">/testing/sessions/{token}/answer</w:t>
+              <w:t xml:space="preserve">/testing/sessions/{token}/accept-suggested</w:t>
             </w:r>
           </w:p>
         </w:tc>
@@ -31420,7 +31612,7 @@
                 <w:sz w:val="15"/>
                 <w:szCs w:val="15"/>
               </w:rPr>
-              <w:t xml:space="preserve">Ответить на текущее задание</w:t>
+              <w:t xml:space="preserve">Принять грейд ниже заявленного по этому же тесту</w:t>
             </w:r>
           </w:p>
         </w:tc>
@@ -31583,7 +31775,7 @@
                 <w:sz w:val="15"/>
                 <w:szCs w:val="15"/>
               </w:rPr>
-              <w:t xml:space="preserve">/testing/sessions/{token}/proctoring</w:t>
+              <w:t xml:space="preserve">/testing/sessions/{token}/answer</w:t>
             </w:r>
           </w:p>
         </w:tc>
@@ -31614,7 +31806,7 @@
                 <w:sz w:val="15"/>
                 <w:szCs w:val="15"/>
               </w:rPr>
-              <w:t xml:space="preserve">Событие прокторинга: снимок экрана, печать, копирование, уход со вкладки</w:t>
+              <w:t xml:space="preserve">Ответить на текущее задание</w:t>
             </w:r>
           </w:p>
         </w:tc>
@@ -31746,7 +31938,7 @@
                 <w:sz w:val="15"/>
                 <w:szCs w:val="15"/>
               </w:rPr>
-              <w:t xml:space="preserve">GET</w:t>
+              <w:t xml:space="preserve">POST</w:t>
             </w:r>
           </w:p>
         </w:tc>
@@ -31778,7 +31970,7 @@
                 <w:sz w:val="15"/>
                 <w:szCs w:val="15"/>
               </w:rPr>
-              <w:t xml:space="preserve">/testing/survey</w:t>
+              <w:t xml:space="preserve">/testing/sessions/{token}/proctoring</w:t>
             </w:r>
           </w:p>
         </w:tc>
@@ -31810,7 +32002,7 @@
                 <w:sz w:val="15"/>
                 <w:szCs w:val="15"/>
               </w:rPr>
-              <w:t xml:space="preserve">Вопросы опроса по отрасли и специализации</w:t>
+              <w:t xml:space="preserve">Событие прокторинга: снимок экрана, печать, копирование, уход со вкладки</w:t>
             </w:r>
           </w:p>
         </w:tc>
@@ -31842,7 +32034,7 @@
                 <w:sz w:val="15"/>
                 <w:szCs w:val="15"/>
               </w:rPr>
-              <w:t xml:space="preserve">200</w:t>
+              <w:t xml:space="preserve">200, 409, 422</w:t>
             </w:r>
           </w:p>
         </w:tc>
@@ -31874,7 +32066,7 @@
                 <w:sz w:val="15"/>
                 <w:szCs w:val="15"/>
               </w:rPr>
-              <w:t xml:space="preserve">нет</w:t>
+              <w:t xml:space="preserve">да</w:t>
             </w:r>
           </w:p>
         </w:tc>
@@ -31942,7 +32134,7 @@
                 <w:sz w:val="15"/>
                 <w:szCs w:val="15"/>
               </w:rPr>
-              <w:t xml:space="preserve">POST</w:t>
+              <w:t xml:space="preserve">GET</w:t>
             </w:r>
           </w:p>
         </w:tc>
@@ -32004,7 +32196,7 @@
                 <w:sz w:val="15"/>
                 <w:szCs w:val="15"/>
               </w:rPr>
-              <w:t xml:space="preserve">Сохранить ответы опроса</w:t>
+              <w:t xml:space="preserve">Вопросы опроса по отрасли и специализации</w:t>
             </w:r>
           </w:p>
         </w:tc>
@@ -32035,7 +32227,7 @@
                 <w:sz w:val="15"/>
                 <w:szCs w:val="15"/>
               </w:rPr>
-              <w:t xml:space="preserve">200, 422</w:t>
+              <w:t xml:space="preserve">200</w:t>
             </w:r>
           </w:p>
         </w:tc>
@@ -32066,7 +32258,7 @@
                 <w:sz w:val="15"/>
                 <w:szCs w:val="15"/>
               </w:rPr>
-              <w:t xml:space="preserve">да</w:t>
+              <w:t xml:space="preserve">нет</w:t>
             </w:r>
           </w:p>
         </w:tc>
@@ -32136,7 +32328,7 @@
                 <w:sz w:val="15"/>
                 <w:szCs w:val="15"/>
               </w:rPr>
-              <w:t xml:space="preserve">GET</w:t>
+              <w:t xml:space="preserve">POST</w:t>
             </w:r>
           </w:p>
         </w:tc>
@@ -32168,7 +32360,7 @@
                 <w:sz w:val="15"/>
                 <w:szCs w:val="15"/>
               </w:rPr>
-              <w:t xml:space="preserve">/testing/survey/history</w:t>
+              <w:t xml:space="preserve">/testing/survey</w:t>
             </w:r>
           </w:p>
         </w:tc>
@@ -32200,7 +32392,7 @@
                 <w:sz w:val="15"/>
                 <w:szCs w:val="15"/>
               </w:rPr>
-              <w:t xml:space="preserve">История ответов на опрос</w:t>
+              <w:t xml:space="preserve">Сохранить ответы опроса</w:t>
             </w:r>
           </w:p>
         </w:tc>
@@ -32232,7 +32424,7 @@
                 <w:sz w:val="15"/>
                 <w:szCs w:val="15"/>
               </w:rPr>
-              <w:t xml:space="preserve">200</w:t>
+              <w:t xml:space="preserve">200, 422</w:t>
             </w:r>
           </w:p>
         </w:tc>
@@ -32301,7 +32493,7 @@
                 <w:sz w:val="15"/>
                 <w:szCs w:val="15"/>
               </w:rPr>
-              <w:t xml:space="preserve">Кандидат: приглашения, вакансии, задания</w:t>
+              <w:t xml:space="preserve">Кандидат: опрос и тестирование</w:t>
             </w:r>
           </w:p>
         </w:tc>
@@ -32363,7 +32555,7 @@
                 <w:sz w:val="15"/>
                 <w:szCs w:val="15"/>
               </w:rPr>
-              <w:t xml:space="preserve">/candidate/applications</w:t>
+              <w:t xml:space="preserve">/testing/survey/history</w:t>
             </w:r>
           </w:p>
         </w:tc>
@@ -32394,7 +32586,7 @@
                 <w:sz w:val="15"/>
                 <w:szCs w:val="15"/>
               </w:rPr>
-              <w:t xml:space="preserve">Мои отклики и их статусы</w:t>
+              <w:t xml:space="preserve">История ответов на опрос</w:t>
             </w:r>
           </w:p>
         </w:tc>
@@ -32526,7 +32718,7 @@
                 <w:sz w:val="15"/>
                 <w:szCs w:val="15"/>
               </w:rPr>
-              <w:t xml:space="preserve">POST</w:t>
+              <w:t xml:space="preserve">GET</w:t>
             </w:r>
           </w:p>
         </w:tc>
@@ -32558,7 +32750,7 @@
                 <w:sz w:val="15"/>
                 <w:szCs w:val="15"/>
               </w:rPr>
-              <w:t xml:space="preserve">/candidate/applications/{app_id}/withdraw</w:t>
+              <w:t xml:space="preserve">/candidate/applications</w:t>
             </w:r>
           </w:p>
         </w:tc>
@@ -32590,7 +32782,7 @@
                 <w:sz w:val="15"/>
                 <w:szCs w:val="15"/>
               </w:rPr>
-              <w:t xml:space="preserve">Отозвать отклик</w:t>
+              <w:t xml:space="preserve">Мои отклики и их статусы</w:t>
             </w:r>
           </w:p>
         </w:tc>
@@ -32622,7 +32814,7 @@
                 <w:sz w:val="15"/>
                 <w:szCs w:val="15"/>
               </w:rPr>
-              <w:t xml:space="preserve">200, 422</w:t>
+              <w:t xml:space="preserve">200</w:t>
             </w:r>
           </w:p>
         </w:tc>
@@ -32722,7 +32914,7 @@
                 <w:sz w:val="15"/>
                 <w:szCs w:val="15"/>
               </w:rPr>
-              <w:t xml:space="preserve">GET</w:t>
+              <w:t xml:space="preserve">POST</w:t>
             </w:r>
           </w:p>
         </w:tc>
@@ -32753,7 +32945,7 @@
                 <w:sz w:val="15"/>
                 <w:szCs w:val="15"/>
               </w:rPr>
-              <w:t xml:space="preserve">/candidate/invitations</w:t>
+              <w:t xml:space="preserve">/candidate/applications/{app_id}/withdraw</w:t>
             </w:r>
           </w:p>
         </w:tc>
@@ -32784,7 +32976,7 @@
                 <w:sz w:val="15"/>
                 <w:szCs w:val="15"/>
               </w:rPr>
-              <w:t xml:space="preserve">Мои приглашения от работодателей</w:t>
+              <w:t xml:space="preserve">Отозвать отклик</w:t>
             </w:r>
           </w:p>
         </w:tc>
@@ -32948,7 +33140,7 @@
                 <w:sz w:val="15"/>
                 <w:szCs w:val="15"/>
               </w:rPr>
-              <w:t xml:space="preserve">/candidate/invitations/{inv_id}</w:t>
+              <w:t xml:space="preserve">/candidate/invitations</w:t>
             </w:r>
           </w:p>
         </w:tc>
@@ -32980,7 +33172,7 @@
                 <w:sz w:val="15"/>
                 <w:szCs w:val="15"/>
               </w:rPr>
-              <w:t xml:space="preserve">Открыть приглашение (статус → «просмотрено»)</w:t>
+              <w:t xml:space="preserve">Мои приглашения от работодателей</w:t>
             </w:r>
           </w:p>
         </w:tc>
@@ -33112,7 +33304,7 @@
                 <w:sz w:val="15"/>
                 <w:szCs w:val="15"/>
               </w:rPr>
-              <w:t xml:space="preserve">POST</w:t>
+              <w:t xml:space="preserve">GET</w:t>
             </w:r>
           </w:p>
         </w:tc>
@@ -33143,7 +33335,7 @@
                 <w:sz w:val="15"/>
                 <w:szCs w:val="15"/>
               </w:rPr>
-              <w:t xml:space="preserve">/candidate/invitations/{inv_id}/accept</w:t>
+              <w:t xml:space="preserve">/candidate/invitations/{inv_id}</w:t>
             </w:r>
           </w:p>
         </w:tc>
@@ -33174,7 +33366,7 @@
                 <w:sz w:val="15"/>
                 <w:szCs w:val="15"/>
               </w:rPr>
-              <w:t xml:space="preserve">Принять приглашение — контакты раскрываются</w:t>
+              <w:t xml:space="preserve">Открыть приглашение (статус → «просмотрено»)</w:t>
             </w:r>
           </w:p>
         </w:tc>
@@ -33205,7 +33397,7 @@
                 <w:sz w:val="15"/>
                 <w:szCs w:val="15"/>
               </w:rPr>
-              <w:t xml:space="preserve">200, 409, 422</w:t>
+              <w:t xml:space="preserve">200, 422</w:t>
             </w:r>
           </w:p>
         </w:tc>
@@ -33338,7 +33530,7 @@
                 <w:sz w:val="15"/>
                 <w:szCs w:val="15"/>
               </w:rPr>
-              <w:t xml:space="preserve">/candidate/invitations/{inv_id}/complain</w:t>
+              <w:t xml:space="preserve">/candidate/invitations/{inv_id}/accept</w:t>
             </w:r>
           </w:p>
         </w:tc>
@@ -33370,7 +33562,7 @@
                 <w:sz w:val="15"/>
                 <w:szCs w:val="15"/>
               </w:rPr>
-              <w:t xml:space="preserve">Пожаловаться на приглашение (фиктивная вакансия и т. п.)</w:t>
+              <w:t xml:space="preserve">Принять приглашение — контакты раскрываются</w:t>
             </w:r>
           </w:p>
         </w:tc>
@@ -33402,7 +33594,7 @@
                 <w:sz w:val="15"/>
                 <w:szCs w:val="15"/>
               </w:rPr>
-              <w:t xml:space="preserve">200, 422</w:t>
+              <w:t xml:space="preserve">200, 409, 422</w:t>
             </w:r>
           </w:p>
         </w:tc>
@@ -33533,7 +33725,7 @@
                 <w:sz w:val="15"/>
                 <w:szCs w:val="15"/>
               </w:rPr>
-              <w:t xml:space="preserve">/candidate/invitations/{inv_id}/decline</w:t>
+              <w:t xml:space="preserve">/candidate/invitations/{inv_id}/complain</w:t>
             </w:r>
           </w:p>
         </w:tc>
@@ -33564,7 +33756,7 @@
                 <w:sz w:val="15"/>
                 <w:szCs w:val="15"/>
               </w:rPr>
-              <w:t xml:space="preserve">Отклонить приглашение с причиной</w:t>
+              <w:t xml:space="preserve">Пожаловаться на приглашение (фиктивная вакансия и т. п.)</w:t>
             </w:r>
           </w:p>
         </w:tc>
@@ -33595,7 +33787,7 @@
                 <w:sz w:val="15"/>
                 <w:szCs w:val="15"/>
               </w:rPr>
-              <w:t xml:space="preserve">200, 409, 422</w:t>
+              <w:t xml:space="preserve">200, 422</w:t>
             </w:r>
           </w:p>
         </w:tc>
@@ -33696,7 +33888,7 @@
                 <w:sz w:val="15"/>
                 <w:szCs w:val="15"/>
               </w:rPr>
-              <w:t xml:space="preserve">GET</w:t>
+              <w:t xml:space="preserve">POST</w:t>
             </w:r>
           </w:p>
         </w:tc>
@@ -33728,7 +33920,7 @@
                 <w:sz w:val="15"/>
                 <w:szCs w:val="15"/>
               </w:rPr>
-              <w:t xml:space="preserve">/candidate/tasks</w:t>
+              <w:t xml:space="preserve">/candidate/invitations/{inv_id}/decline</w:t>
             </w:r>
           </w:p>
         </w:tc>
@@ -33760,7 +33952,7 @@
                 <w:sz w:val="15"/>
                 <w:szCs w:val="15"/>
               </w:rPr>
-              <w:t xml:space="preserve">Регулярные задания от работодателей (система периодически предлагает новые)</w:t>
+              <w:t xml:space="preserve">Отклонить приглашение с причиной</w:t>
             </w:r>
           </w:p>
         </w:tc>
@@ -33792,7 +33984,7 @@
                 <w:sz w:val="15"/>
                 <w:szCs w:val="15"/>
               </w:rPr>
-              <w:t xml:space="preserve">200</w:t>
+              <w:t xml:space="preserve">200, 409, 422</w:t>
             </w:r>
           </w:p>
         </w:tc>
@@ -33892,7 +34084,7 @@
                 <w:sz w:val="15"/>
                 <w:szCs w:val="15"/>
               </w:rPr>
-              <w:t xml:space="preserve">POST</w:t>
+              <w:t xml:space="preserve">GET</w:t>
             </w:r>
           </w:p>
         </w:tc>
@@ -33923,7 +34115,7 @@
                 <w:sz w:val="15"/>
                 <w:szCs w:val="15"/>
               </w:rPr>
-              <w:t xml:space="preserve">/candidate/tasks/{ta_id}/skip</w:t>
+              <w:t xml:space="preserve">/candidate/tasks</w:t>
             </w:r>
           </w:p>
         </w:tc>
@@ -33954,7 +34146,7 @@
                 <w:sz w:val="15"/>
                 <w:szCs w:val="15"/>
               </w:rPr>
-              <w:t xml:space="preserve">Пропустить задание</w:t>
+              <w:t xml:space="preserve">Регулярные задания от работодателей (система периодически предлагает новые)</w:t>
             </w:r>
           </w:p>
         </w:tc>
@@ -33985,7 +34177,7 @@
                 <w:sz w:val="15"/>
                 <w:szCs w:val="15"/>
               </w:rPr>
-              <w:t xml:space="preserve">200, 422</w:t>
+              <w:t xml:space="preserve">200</w:t>
             </w:r>
           </w:p>
         </w:tc>
@@ -34118,7 +34310,7 @@
                 <w:sz w:val="15"/>
                 <w:szCs w:val="15"/>
               </w:rPr>
-              <w:t xml:space="preserve">/candidate/tasks/{ta_id}/submit</w:t>
+              <w:t xml:space="preserve">/candidate/tasks/{ta_id}/skip</w:t>
             </w:r>
           </w:p>
         </w:tc>
@@ -34150,7 +34342,7 @@
                 <w:sz w:val="15"/>
                 <w:szCs w:val="15"/>
               </w:rPr>
-              <w:t xml:space="preserve">Отправить решение или подход</w:t>
+              <w:t xml:space="preserve">Пропустить задание</w:t>
             </w:r>
           </w:p>
         </w:tc>
@@ -34182,7 +34374,7 @@
                 <w:sz w:val="15"/>
                 <w:szCs w:val="15"/>
               </w:rPr>
-              <w:t xml:space="preserve">200, 409, 422</w:t>
+              <w:t xml:space="preserve">200, 422</w:t>
             </w:r>
           </w:p>
         </w:tc>
@@ -34282,7 +34474,7 @@
                 <w:sz w:val="15"/>
                 <w:szCs w:val="15"/>
               </w:rPr>
-              <w:t xml:space="preserve">GET</w:t>
+              <w:t xml:space="preserve">POST</w:t>
             </w:r>
           </w:p>
         </w:tc>
@@ -34313,7 +34505,7 @@
                 <w:sz w:val="15"/>
                 <w:szCs w:val="15"/>
               </w:rPr>
-              <w:t xml:space="preserve">/notifications</w:t>
+              <w:t xml:space="preserve">/candidate/tasks/{ta_id}/submit</w:t>
             </w:r>
           </w:p>
         </w:tc>
@@ -34344,7 +34536,7 @@
                 <w:sz w:val="15"/>
                 <w:szCs w:val="15"/>
               </w:rPr>
-              <w:t xml:space="preserve">Мои уведомления</w:t>
+              <w:t xml:space="preserve">Отправить решение или подход</w:t>
             </w:r>
           </w:p>
         </w:tc>
@@ -34375,7 +34567,7 @@
                 <w:sz w:val="15"/>
                 <w:szCs w:val="15"/>
               </w:rPr>
-              <w:t xml:space="preserve">200, 422</w:t>
+              <w:t xml:space="preserve">200, 409, 422</w:t>
             </w:r>
           </w:p>
         </w:tc>
@@ -34476,7 +34668,7 @@
                 <w:sz w:val="15"/>
                 <w:szCs w:val="15"/>
               </w:rPr>
-              <w:t xml:space="preserve">POST</w:t>
+              <w:t xml:space="preserve">GET</w:t>
             </w:r>
           </w:p>
         </w:tc>
@@ -34508,7 +34700,7 @@
                 <w:sz w:val="15"/>
                 <w:szCs w:val="15"/>
               </w:rPr>
-              <w:t xml:space="preserve">/notifications/read</w:t>
+              <w:t xml:space="preserve">/notifications</w:t>
             </w:r>
           </w:p>
         </w:tc>
@@ -34540,7 +34732,7 @@
                 <w:sz w:val="15"/>
                 <w:szCs w:val="15"/>
               </w:rPr>
-              <w:t xml:space="preserve">Отметить все уведомления прочитанными</w:t>
+              <w:t xml:space="preserve">Мои уведомления</w:t>
             </w:r>
           </w:p>
         </w:tc>
@@ -34572,7 +34764,7 @@
                 <w:sz w:val="15"/>
                 <w:szCs w:val="15"/>
               </w:rPr>
-              <w:t xml:space="preserve">200</w:t>
+              <w:t xml:space="preserve">200, 422</w:t>
             </w:r>
           </w:p>
         </w:tc>
@@ -34672,7 +34864,7 @@
                 <w:sz w:val="15"/>
                 <w:szCs w:val="15"/>
               </w:rPr>
-              <w:t xml:space="preserve">GET</w:t>
+              <w:t xml:space="preserve">POST</w:t>
             </w:r>
           </w:p>
         </w:tc>
@@ -34703,7 +34895,7 @@
                 <w:sz w:val="15"/>
                 <w:szCs w:val="15"/>
               </w:rPr>
-              <w:t xml:space="preserve">/vacancies</w:t>
+              <w:t xml:space="preserve">/notifications/read</w:t>
             </w:r>
           </w:p>
         </w:tc>
@@ -34734,7 +34926,7 @@
                 <w:sz w:val="15"/>
                 <w:szCs w:val="15"/>
               </w:rPr>
-              <w:t xml:space="preserve">Опубликованные вакансии (с оценкой совпадения для кандидата)</w:t>
+              <w:t xml:space="preserve">Отметить все уведомления прочитанными</w:t>
             </w:r>
           </w:p>
         </w:tc>
@@ -34765,7 +34957,7 @@
                 <w:sz w:val="15"/>
                 <w:szCs w:val="15"/>
               </w:rPr>
-              <w:t xml:space="preserve">200, 422</w:t>
+              <w:t xml:space="preserve">200</w:t>
             </w:r>
           </w:p>
         </w:tc>
@@ -34898,7 +35090,7 @@
                 <w:sz w:val="15"/>
                 <w:szCs w:val="15"/>
               </w:rPr>
-              <w:t xml:space="preserve">/vacancies/{vac_id}</w:t>
+              <w:t xml:space="preserve">/vacancies</w:t>
             </w:r>
           </w:p>
         </w:tc>
@@ -34930,7 +35122,7 @@
                 <w:sz w:val="15"/>
                 <w:szCs w:val="15"/>
               </w:rPr>
-              <w:t xml:space="preserve">Вакансия</w:t>
+              <w:t xml:space="preserve">Опубликованные вакансии (с оценкой совпадения для кандидата)</w:t>
             </w:r>
           </w:p>
         </w:tc>
@@ -35062,7 +35254,7 @@
                 <w:sz w:val="15"/>
                 <w:szCs w:val="15"/>
               </w:rPr>
-              <w:t xml:space="preserve">POST</w:t>
+              <w:t xml:space="preserve">GET</w:t>
             </w:r>
           </w:p>
         </w:tc>
@@ -35093,7 +35285,7 @@
                 <w:sz w:val="15"/>
                 <w:szCs w:val="15"/>
               </w:rPr>
-              <w:t xml:space="preserve">/vacancies/{vac_id}/apply</w:t>
+              <w:t xml:space="preserve">/vacancies/{vac_id}</w:t>
             </w:r>
           </w:p>
         </w:tc>
@@ -35124,7 +35316,7 @@
                 <w:sz w:val="15"/>
                 <w:szCs w:val="15"/>
               </w:rPr>
-              <w:t xml:space="preserve">Откликнуться на вакансию</w:t>
+              <w:t xml:space="preserve">Вакансия</w:t>
             </w:r>
           </w:p>
         </w:tc>
@@ -35155,7 +35347,7 @@
                 <w:sz w:val="15"/>
                 <w:szCs w:val="15"/>
               </w:rPr>
-              <w:t xml:space="preserve">200, 409, 422</w:t>
+              <w:t xml:space="preserve">200, 422</w:t>
             </w:r>
           </w:p>
         </w:tc>
@@ -35224,7 +35416,7 @@
                 <w:sz w:val="15"/>
                 <w:szCs w:val="15"/>
               </w:rPr>
-              <w:t xml:space="preserve">Работодатель</w:t>
+              <w:t xml:space="preserve">Кандидат: приглашения, вакансии, задания</w:t>
             </w:r>
           </w:p>
         </w:tc>
@@ -35256,7 +35448,7 @@
                 <w:sz w:val="15"/>
                 <w:szCs w:val="15"/>
               </w:rPr>
-              <w:t xml:space="preserve">PUT</w:t>
+              <w:t xml:space="preserve">POST</w:t>
             </w:r>
           </w:p>
         </w:tc>
@@ -35288,7 +35480,7 @@
                 <w:sz w:val="15"/>
                 <w:szCs w:val="15"/>
               </w:rPr>
-              <w:t xml:space="preserve">/employer/applications/{app_id}</w:t>
+              <w:t xml:space="preserve">/vacancies/{vac_id}/apply</w:t>
             </w:r>
           </w:p>
         </w:tc>
@@ -35320,7 +35512,7 @@
                 <w:sz w:val="15"/>
                 <w:szCs w:val="15"/>
               </w:rPr>
-              <w:t xml:space="preserve">Изменить статус отклика</w:t>
+              <w:t xml:space="preserve">Откликнуться на вакансию</w:t>
             </w:r>
           </w:p>
         </w:tc>
@@ -35352,7 +35544,7 @@
                 <w:sz w:val="15"/>
                 <w:szCs w:val="15"/>
               </w:rPr>
-              <w:t xml:space="preserve">200, 422</w:t>
+              <w:t xml:space="preserve">200, 409, 422</w:t>
             </w:r>
           </w:p>
         </w:tc>
@@ -35452,7 +35644,7 @@
                 <w:sz w:val="15"/>
                 <w:szCs w:val="15"/>
               </w:rPr>
-              <w:t xml:space="preserve">GET</w:t>
+              <w:t xml:space="preserve">PUT</w:t>
             </w:r>
           </w:p>
         </w:tc>
@@ -35483,7 +35675,7 @@
                 <w:sz w:val="15"/>
                 <w:szCs w:val="15"/>
               </w:rPr>
-              <w:t xml:space="preserve">/employer/candidates</w:t>
+              <w:t xml:space="preserve">/employer/applications/{app_id}</w:t>
             </w:r>
           </w:p>
         </w:tc>
@@ -35514,7 +35706,7 @@
                 <w:sz w:val="15"/>
                 <w:szCs w:val="15"/>
               </w:rPr>
-              <w:t xml:space="preserve">Поиск по банку кандидатов</w:t>
+              <w:t xml:space="preserve">Изменить статус отклика</w:t>
             </w:r>
           </w:p>
         </w:tc>
@@ -35678,7 +35870,7 @@
                 <w:sz w:val="15"/>
                 <w:szCs w:val="15"/>
               </w:rPr>
-              <w:t xml:space="preserve">/employer/candidates/{cid}</w:t>
+              <w:t xml:space="preserve">/employer/candidates</w:t>
             </w:r>
           </w:p>
         </w:tc>
@@ -35710,7 +35902,7 @@
                 <w:sz w:val="15"/>
                 <w:szCs w:val="15"/>
               </w:rPr>
-              <w:t xml:space="preserve">Карточка кандидата (контакты — только после принятия приглашения/отклика)</w:t>
+              <w:t xml:space="preserve">Поиск по банку кандидатов</w:t>
             </w:r>
           </w:p>
         </w:tc>
@@ -35873,7 +36065,7 @@
                 <w:sz w:val="15"/>
                 <w:szCs w:val="15"/>
               </w:rPr>
-              <w:t xml:space="preserve">/employer/candidates/{cid}/fsp</w:t>
+              <w:t xml:space="preserve">/employer/candidates/{cid}</w:t>
             </w:r>
           </w:p>
         </w:tc>
@@ -35904,7 +36096,7 @@
                 <w:sz w:val="15"/>
                 <w:szCs w:val="15"/>
               </w:rPr>
-              <w:t xml:space="preserve">Достижения ФСП кандидата (если он разрешил показ)</w:t>
+              <w:t xml:space="preserve">Карточка кандидата (контакты — только после принятия приглашения/отклика)</w:t>
             </w:r>
           </w:p>
         </w:tc>
@@ -36068,7 +36260,7 @@
                 <w:sz w:val="15"/>
                 <w:szCs w:val="15"/>
               </w:rPr>
-              <w:t xml:space="preserve">/employer/candidates/{cid}/pdf</w:t>
+              <w:t xml:space="preserve">/employer/candidates/{cid}/fsp</w:t>
             </w:r>
           </w:p>
         </w:tc>
@@ -36100,7 +36292,7 @@
                 <w:sz w:val="15"/>
                 <w:szCs w:val="15"/>
               </w:rPr>
-              <w:t xml:space="preserve">Стандартизированный PDF-профиль кандидата</w:t>
+              <w:t xml:space="preserve">Достижения ФСП кандидата (если он разрешил показ)</w:t>
             </w:r>
           </w:p>
         </w:tc>
@@ -36263,7 +36455,7 @@
                 <w:sz w:val="15"/>
                 <w:szCs w:val="15"/>
               </w:rPr>
-              <w:t xml:space="preserve">/employer/company</w:t>
+              <w:t xml:space="preserve">/employer/candidates/{cid}/pdf</w:t>
             </w:r>
           </w:p>
         </w:tc>
@@ -36294,7 +36486,7 @@
                 <w:sz w:val="15"/>
                 <w:szCs w:val="15"/>
               </w:rPr>
-              <w:t xml:space="preserve">Профиль компании</w:t>
+              <w:t xml:space="preserve">Стандартизированный PDF-профиль кандидата</w:t>
             </w:r>
           </w:p>
         </w:tc>
@@ -36325,7 +36517,7 @@
                 <w:sz w:val="15"/>
                 <w:szCs w:val="15"/>
               </w:rPr>
-              <w:t xml:space="preserve">200</w:t>
+              <w:t xml:space="preserve">200, 422</w:t>
             </w:r>
           </w:p>
         </w:tc>
@@ -36426,7 +36618,7 @@
                 <w:sz w:val="15"/>
                 <w:szCs w:val="15"/>
               </w:rPr>
-              <w:t xml:space="preserve">PUT</w:t>
+              <w:t xml:space="preserve">GET</w:t>
             </w:r>
           </w:p>
         </w:tc>
@@ -36490,7 +36682,7 @@
                 <w:sz w:val="15"/>
                 <w:szCs w:val="15"/>
               </w:rPr>
-              <w:t xml:space="preserve">Обновить профиль компании</w:t>
+              <w:t xml:space="preserve">Профиль компании</w:t>
             </w:r>
           </w:p>
         </w:tc>
@@ -36522,7 +36714,7 @@
                 <w:sz w:val="15"/>
                 <w:szCs w:val="15"/>
               </w:rPr>
-              <w:t xml:space="preserve">200, 422</w:t>
+              <w:t xml:space="preserve">200</w:t>
             </w:r>
           </w:p>
         </w:tc>
@@ -36622,7 +36814,7 @@
                 <w:sz w:val="15"/>
                 <w:szCs w:val="15"/>
               </w:rPr>
-              <w:t xml:space="preserve">GET</w:t>
+              <w:t xml:space="preserve">PUT</w:t>
             </w:r>
           </w:p>
         </w:tc>
@@ -36653,7 +36845,7 @@
                 <w:sz w:val="15"/>
                 <w:szCs w:val="15"/>
               </w:rPr>
-              <w:t xml:space="preserve">/employer/dashboard</w:t>
+              <w:t xml:space="preserve">/employer/company</w:t>
             </w:r>
           </w:p>
         </w:tc>
@@ -36684,7 +36876,7 @@
                 <w:sz w:val="15"/>
                 <w:szCs w:val="15"/>
               </w:rPr>
-              <w:t xml:space="preserve">Сводка работодателя</w:t>
+              <w:t xml:space="preserve">Обновить профиль компании</w:t>
             </w:r>
           </w:p>
         </w:tc>
@@ -36715,7 +36907,7 @@
                 <w:sz w:val="15"/>
                 <w:szCs w:val="15"/>
               </w:rPr>
-              <w:t xml:space="preserve">200</w:t>
+              <w:t xml:space="preserve">200, 422</w:t>
             </w:r>
           </w:p>
         </w:tc>
@@ -36848,7 +37040,7 @@
                 <w:sz w:val="15"/>
                 <w:szCs w:val="15"/>
               </w:rPr>
-              <w:t xml:space="preserve">/employer/invitations</w:t>
+              <w:t xml:space="preserve">/employer/dashboard</w:t>
             </w:r>
           </w:p>
         </w:tc>
@@ -36880,7 +37072,7 @@
                 <w:sz w:val="15"/>
                 <w:szCs w:val="15"/>
               </w:rPr>
-              <w:t xml:space="preserve">Отправленные приглашения и их статусы</w:t>
+              <w:t xml:space="preserve">Сводка работодателя</w:t>
             </w:r>
           </w:p>
         </w:tc>
@@ -36912,7 +37104,7 @@
                 <w:sz w:val="15"/>
                 <w:szCs w:val="15"/>
               </w:rPr>
-              <w:t xml:space="preserve">200, 422</w:t>
+              <w:t xml:space="preserve">200</w:t>
             </w:r>
           </w:p>
         </w:tc>
@@ -37012,7 +37204,7 @@
                 <w:sz w:val="15"/>
                 <w:szCs w:val="15"/>
               </w:rPr>
-              <w:t xml:space="preserve">POST</w:t>
+              <w:t xml:space="preserve">GET</w:t>
             </w:r>
           </w:p>
         </w:tc>
@@ -37074,7 +37266,7 @@
                 <w:sz w:val="15"/>
                 <w:szCs w:val="15"/>
               </w:rPr>
-              <w:t xml:space="preserve">Пригласить кандидата (вилка ЗП обязательна)</w:t>
+              <w:t xml:space="preserve">Отправленные приглашения и их статусы</w:t>
             </w:r>
           </w:p>
         </w:tc>
@@ -37105,7 +37297,7 @@
                 <w:sz w:val="15"/>
                 <w:szCs w:val="15"/>
               </w:rPr>
-              <w:t xml:space="preserve">201, 409, 422, 429</w:t>
+              <w:t xml:space="preserve">200, 422</w:t>
             </w:r>
           </w:p>
         </w:tc>
@@ -37238,7 +37430,7 @@
                 <w:sz w:val="15"/>
                 <w:szCs w:val="15"/>
               </w:rPr>
-              <w:t xml:space="preserve">/employer/invitations/{inv_id}/withdraw</w:t>
+              <w:t xml:space="preserve">/employer/invitations</w:t>
             </w:r>
           </w:p>
         </w:tc>
@@ -37270,7 +37462,7 @@
                 <w:sz w:val="15"/>
                 <w:szCs w:val="15"/>
               </w:rPr>
-              <w:t xml:space="preserve">Отозвать приглашение</w:t>
+              <w:t xml:space="preserve">Пригласить кандидата (вилка ЗП обязательна)</w:t>
             </w:r>
           </w:p>
         </w:tc>
@@ -37302,7 +37494,7 @@
                 <w:sz w:val="15"/>
                 <w:szCs w:val="15"/>
               </w:rPr>
-              <w:t xml:space="preserve">200, 422</w:t>
+              <w:t xml:space="preserve">201, 409, 422, 429</w:t>
             </w:r>
           </w:p>
         </w:tc>
@@ -37402,7 +37594,7 @@
                 <w:sz w:val="15"/>
                 <w:szCs w:val="15"/>
               </w:rPr>
-              <w:t xml:space="preserve">GET</w:t>
+              <w:t xml:space="preserve">POST</w:t>
             </w:r>
           </w:p>
         </w:tc>
@@ -37433,7 +37625,7 @@
                 <w:sz w:val="15"/>
                 <w:szCs w:val="15"/>
               </w:rPr>
-              <w:t xml:space="preserve">/employer/likelihood/{cid}</w:t>
+              <w:t xml:space="preserve">/employer/invitations/{inv_id}/withdraw</w:t>
             </w:r>
           </w:p>
         </w:tc>
@@ -37464,7 +37656,7 @@
                 <w:sz w:val="15"/>
                 <w:szCs w:val="15"/>
               </w:rPr>
-              <w:t xml:space="preserve">Оценка вероятности принятия приглашения при заданной вилке</w:t>
+              <w:t xml:space="preserve">Отозвать приглашение</w:t>
             </w:r>
           </w:p>
         </w:tc>
@@ -37628,7 +37820,7 @@
                 <w:sz w:val="15"/>
                 <w:szCs w:val="15"/>
               </w:rPr>
-              <w:t xml:space="preserve">/employer/selections</w:t>
+              <w:t xml:space="preserve">/employer/likelihood/{cid}</w:t>
             </w:r>
           </w:p>
         </w:tc>
@@ -37660,7 +37852,7 @@
                 <w:sz w:val="15"/>
                 <w:szCs w:val="15"/>
               </w:rPr>
-              <w:t xml:space="preserve">История подборок</w:t>
+              <w:t xml:space="preserve">Оценка вероятности принятия приглашения при заданной вилке</w:t>
             </w:r>
           </w:p>
         </w:tc>
@@ -37692,7 +37884,7 @@
                 <w:sz w:val="15"/>
                 <w:szCs w:val="15"/>
               </w:rPr>
-              <w:t xml:space="preserve">200</w:t>
+              <w:t xml:space="preserve">200, 422</w:t>
             </w:r>
           </w:p>
         </w:tc>
@@ -37792,7 +37984,7 @@
                 <w:sz w:val="15"/>
                 <w:szCs w:val="15"/>
               </w:rPr>
-              <w:t xml:space="preserve">POST</w:t>
+              <w:t xml:space="preserve">GET</w:t>
             </w:r>
           </w:p>
         </w:tc>
@@ -37854,7 +38046,7 @@
                 <w:sz w:val="15"/>
                 <w:szCs w:val="15"/>
               </w:rPr>
-              <w:t xml:space="preserve">Сформировать подборку по потребности</w:t>
+              <w:t xml:space="preserve">История подборок</w:t>
             </w:r>
           </w:p>
         </w:tc>
@@ -37885,7 +38077,7 @@
                 <w:sz w:val="15"/>
                 <w:szCs w:val="15"/>
               </w:rPr>
-              <w:t xml:space="preserve">201, 422</w:t>
+              <w:t xml:space="preserve">200</w:t>
             </w:r>
           </w:p>
         </w:tc>
@@ -37986,7 +38178,7 @@
                 <w:sz w:val="15"/>
                 <w:szCs w:val="15"/>
               </w:rPr>
-              <w:t xml:space="preserve">GET</w:t>
+              <w:t xml:space="preserve">POST</w:t>
             </w:r>
           </w:p>
         </w:tc>
@@ -38018,7 +38210,7 @@
                 <w:sz w:val="15"/>
                 <w:szCs w:val="15"/>
               </w:rPr>
-              <w:t xml:space="preserve">/employer/selections/{sid}</w:t>
+              <w:t xml:space="preserve">/employer/selections</w:t>
             </w:r>
           </w:p>
         </w:tc>
@@ -38050,7 +38242,7 @@
                 <w:sz w:val="15"/>
                 <w:szCs w:val="15"/>
               </w:rPr>
-              <w:t xml:space="preserve">Подборка с уточняющими фильтрами (поверх сохранённого результата)</w:t>
+              <w:t xml:space="preserve">Сформировать подборку по потребности</w:t>
             </w:r>
           </w:p>
         </w:tc>
@@ -38082,7 +38274,7 @@
                 <w:sz w:val="15"/>
                 <w:szCs w:val="15"/>
               </w:rPr>
-              <w:t xml:space="preserve">200, 422</w:t>
+              <w:t xml:space="preserve">201, 422</w:t>
             </w:r>
           </w:p>
         </w:tc>
@@ -38182,7 +38374,7 @@
                 <w:sz w:val="15"/>
                 <w:szCs w:val="15"/>
               </w:rPr>
-              <w:t xml:space="preserve">POST</w:t>
+              <w:t xml:space="preserve">GET</w:t>
             </w:r>
           </w:p>
         </w:tc>
@@ -38213,7 +38405,7 @@
                 <w:sz w:val="15"/>
                 <w:szCs w:val="15"/>
               </w:rPr>
-              <w:t xml:space="preserve">/employer/selections/{sid}/refresh</w:t>
+              <w:t xml:space="preserve">/employer/selections/{sid}</w:t>
             </w:r>
           </w:p>
         </w:tc>
@@ -38244,7 +38436,7 @@
                 <w:sz w:val="15"/>
                 <w:szCs w:val="15"/>
               </w:rPr>
-              <w:t xml:space="preserve">Пересчитать подборку на текущей базе кандидатов</w:t>
+              <w:t xml:space="preserve">Подборка с уточняющими фильтрами (поверх сохранённого результата)</w:t>
             </w:r>
           </w:p>
         </w:tc>
@@ -38376,7 +38568,7 @@
                 <w:sz w:val="15"/>
                 <w:szCs w:val="15"/>
               </w:rPr>
-              <w:t xml:space="preserve">GET</w:t>
+              <w:t xml:space="preserve">POST</w:t>
             </w:r>
           </w:p>
         </w:tc>
@@ -38408,7 +38600,7 @@
                 <w:sz w:val="15"/>
                 <w:szCs w:val="15"/>
               </w:rPr>
-              <w:t xml:space="preserve">/employer/shortlist</w:t>
+              <w:t xml:space="preserve">/employer/selections/{sid}/refresh</w:t>
             </w:r>
           </w:p>
         </w:tc>
@@ -38440,7 +38632,7 @@
                 <w:sz w:val="15"/>
                 <w:szCs w:val="15"/>
               </w:rPr>
-              <w:t xml:space="preserve">Избранные кандидаты</w:t>
+              <w:t xml:space="preserve">Пересчитать подборку на текущей базе кандидатов</w:t>
             </w:r>
           </w:p>
         </w:tc>
@@ -38472,7 +38664,7 @@
                 <w:sz w:val="15"/>
                 <w:szCs w:val="15"/>
               </w:rPr>
-              <w:t xml:space="preserve">200</w:t>
+              <w:t xml:space="preserve">200, 422</w:t>
             </w:r>
           </w:p>
         </w:tc>
@@ -38572,7 +38764,7 @@
                 <w:sz w:val="15"/>
                 <w:szCs w:val="15"/>
               </w:rPr>
-              <w:t xml:space="preserve">POST</w:t>
+              <w:t xml:space="preserve">GET</w:t>
             </w:r>
           </w:p>
         </w:tc>
@@ -38634,7 +38826,7 @@
                 <w:sz w:val="15"/>
                 <w:szCs w:val="15"/>
               </w:rPr>
-              <w:t xml:space="preserve">Добавить кандидата в избранное</w:t>
+              <w:t xml:space="preserve">Избранные кандидаты</w:t>
             </w:r>
           </w:p>
         </w:tc>
@@ -38665,7 +38857,7 @@
                 <w:sz w:val="15"/>
                 <w:szCs w:val="15"/>
               </w:rPr>
-              <w:t xml:space="preserve">201, 422</w:t>
+              <w:t xml:space="preserve">200</w:t>
             </w:r>
           </w:p>
         </w:tc>
@@ -38766,7 +38958,7 @@
                 <w:sz w:val="15"/>
                 <w:szCs w:val="15"/>
               </w:rPr>
-              <w:t xml:space="preserve">DELETE</w:t>
+              <w:t xml:space="preserve">POST</w:t>
             </w:r>
           </w:p>
         </w:tc>
@@ -38798,7 +38990,7 @@
                 <w:sz w:val="15"/>
                 <w:szCs w:val="15"/>
               </w:rPr>
-              <w:t xml:space="preserve">/employer/shortlist/{candidate_id}</w:t>
+              <w:t xml:space="preserve">/employer/shortlist</w:t>
             </w:r>
           </w:p>
         </w:tc>
@@ -38830,7 +39022,7 @@
                 <w:sz w:val="15"/>
                 <w:szCs w:val="15"/>
               </w:rPr>
-              <w:t xml:space="preserve">Убрать из избранного</w:t>
+              <w:t xml:space="preserve">Добавить кандидата в избранное</w:t>
             </w:r>
           </w:p>
         </w:tc>
@@ -38862,7 +39054,7 @@
                 <w:sz w:val="15"/>
                 <w:szCs w:val="15"/>
               </w:rPr>
-              <w:t xml:space="preserve">200, 422</w:t>
+              <w:t xml:space="preserve">201, 422</w:t>
             </w:r>
           </w:p>
         </w:tc>
@@ -38962,7 +39154,7 @@
                 <w:sz w:val="15"/>
                 <w:szCs w:val="15"/>
               </w:rPr>
-              <w:t xml:space="preserve">POST</w:t>
+              <w:t xml:space="preserve">DELETE</w:t>
             </w:r>
           </w:p>
         </w:tc>
@@ -38993,7 +39185,7 @@
                 <w:sz w:val="15"/>
                 <w:szCs w:val="15"/>
               </w:rPr>
-              <w:t xml:space="preserve">/employer/submissions/{ta_id}/review</w:t>
+              <w:t xml:space="preserve">/employer/shortlist/{candidate_id}</w:t>
             </w:r>
           </w:p>
         </w:tc>
@@ -39024,7 +39216,7 @@
                 <w:sz w:val="15"/>
                 <w:szCs w:val="15"/>
               </w:rPr>
-              <w:t xml:space="preserve">Оценить решение (влияет на актуальность профиля кандидата)</w:t>
+              <w:t xml:space="preserve">Убрать из избранного</w:t>
             </w:r>
           </w:p>
         </w:tc>
@@ -39156,7 +39348,7 @@
                 <w:sz w:val="15"/>
                 <w:szCs w:val="15"/>
               </w:rPr>
-              <w:t xml:space="preserve">GET</w:t>
+              <w:t xml:space="preserve">POST</w:t>
             </w:r>
           </w:p>
         </w:tc>
@@ -39188,7 +39380,7 @@
                 <w:sz w:val="15"/>
                 <w:szCs w:val="15"/>
               </w:rPr>
-              <w:t xml:space="preserve">/employer/tasks</w:t>
+              <w:t xml:space="preserve">/employer/submissions/{ta_id}/review</w:t>
             </w:r>
           </w:p>
         </w:tc>
@@ -39220,7 +39412,7 @@
                 <w:sz w:val="15"/>
                 <w:szCs w:val="15"/>
               </w:rPr>
-              <w:t xml:space="preserve">Мои регулярные задания</w:t>
+              <w:t xml:space="preserve">Оценить решение (влияет на актуальность профиля кандидата)</w:t>
             </w:r>
           </w:p>
         </w:tc>
@@ -39252,7 +39444,7 @@
                 <w:sz w:val="15"/>
                 <w:szCs w:val="15"/>
               </w:rPr>
-              <w:t xml:space="preserve">200</w:t>
+              <w:t xml:space="preserve">200, 422</w:t>
             </w:r>
           </w:p>
         </w:tc>
@@ -39352,7 +39544,7 @@
                 <w:sz w:val="15"/>
                 <w:szCs w:val="15"/>
               </w:rPr>
-              <w:t xml:space="preserve">POST</w:t>
+              <w:t xml:space="preserve">GET</w:t>
             </w:r>
           </w:p>
         </w:tc>
@@ -39414,7 +39606,7 @@
                 <w:sz w:val="15"/>
                 <w:szCs w:val="15"/>
               </w:rPr>
-              <w:t xml:space="preserve">Создать короткое задание для кандидатов категории</w:t>
+              <w:t xml:space="preserve">Мои регулярные задания</w:t>
             </w:r>
           </w:p>
         </w:tc>
@@ -39445,7 +39637,7 @@
                 <w:sz w:val="15"/>
                 <w:szCs w:val="15"/>
               </w:rPr>
-              <w:t xml:space="preserve">201, 422</w:t>
+              <w:t xml:space="preserve">200</w:t>
             </w:r>
           </w:p>
         </w:tc>
@@ -39546,7 +39738,7 @@
                 <w:sz w:val="15"/>
                 <w:szCs w:val="15"/>
               </w:rPr>
-              <w:t xml:space="preserve">GET</w:t>
+              <w:t xml:space="preserve">POST</w:t>
             </w:r>
           </w:p>
         </w:tc>
@@ -39578,7 +39770,7 @@
                 <w:sz w:val="15"/>
                 <w:szCs w:val="15"/>
               </w:rPr>
-              <w:t xml:space="preserve">/employer/tasks/submissions</w:t>
+              <w:t xml:space="preserve">/employer/tasks</w:t>
             </w:r>
           </w:p>
         </w:tc>
@@ -39610,7 +39802,7 @@
                 <w:sz w:val="15"/>
                 <w:szCs w:val="15"/>
               </w:rPr>
-              <w:t xml:space="preserve">Решения кандидатов на проверку</w:t>
+              <w:t xml:space="preserve">Создать короткое задание для кандидатов категории</w:t>
             </w:r>
           </w:p>
         </w:tc>
@@ -39642,7 +39834,7 @@
                 <w:sz w:val="15"/>
                 <w:szCs w:val="15"/>
               </w:rPr>
-              <w:t xml:space="preserve">200, 422</w:t>
+              <w:t xml:space="preserve">201, 422</w:t>
             </w:r>
           </w:p>
         </w:tc>
@@ -39742,7 +39934,7 @@
                 <w:sz w:val="15"/>
                 <w:szCs w:val="15"/>
               </w:rPr>
-              <w:t xml:space="preserve">PUT</w:t>
+              <w:t xml:space="preserve">GET</w:t>
             </w:r>
           </w:p>
         </w:tc>
@@ -39773,7 +39965,7 @@
                 <w:sz w:val="15"/>
                 <w:szCs w:val="15"/>
               </w:rPr>
-              <w:t xml:space="preserve">/employer/tasks/{tid}</w:t>
+              <w:t xml:space="preserve">/employer/tasks/submissions</w:t>
             </w:r>
           </w:p>
         </w:tc>
@@ -39804,7 +39996,7 @@
                 <w:sz w:val="15"/>
                 <w:szCs w:val="15"/>
               </w:rPr>
-              <w:t xml:space="preserve">Изменить задание</w:t>
+              <w:t xml:space="preserve">Решения кандидатов на проверку</w:t>
             </w:r>
           </w:p>
         </w:tc>
@@ -39936,7 +40128,7 @@
                 <w:sz w:val="15"/>
                 <w:szCs w:val="15"/>
               </w:rPr>
-              <w:t xml:space="preserve">GET</w:t>
+              <w:t xml:space="preserve">PUT</w:t>
             </w:r>
           </w:p>
         </w:tc>
@@ -39968,7 +40160,7 @@
                 <w:sz w:val="15"/>
                 <w:szCs w:val="15"/>
               </w:rPr>
-              <w:t xml:space="preserve">/employer/vacancies</w:t>
+              <w:t xml:space="preserve">/employer/tasks/{tid}</w:t>
             </w:r>
           </w:p>
         </w:tc>
@@ -40000,7 +40192,7 @@
                 <w:sz w:val="15"/>
                 <w:szCs w:val="15"/>
               </w:rPr>
-              <w:t xml:space="preserve">Мои потребности и вакансии</w:t>
+              <w:t xml:space="preserve">Изменить задание</w:t>
             </w:r>
           </w:p>
         </w:tc>
@@ -40032,7 +40224,7 @@
                 <w:sz w:val="15"/>
                 <w:szCs w:val="15"/>
               </w:rPr>
-              <w:t xml:space="preserve">200</w:t>
+              <w:t xml:space="preserve">200, 422</w:t>
             </w:r>
           </w:p>
         </w:tc>
@@ -40132,7 +40324,7 @@
                 <w:sz w:val="15"/>
                 <w:szCs w:val="15"/>
               </w:rPr>
-              <w:t xml:space="preserve">POST</w:t>
+              <w:t xml:space="preserve">GET</w:t>
             </w:r>
           </w:p>
         </w:tc>
@@ -40194,7 +40386,7 @@
                 <w:sz w:val="15"/>
                 <w:szCs w:val="15"/>
               </w:rPr>
-              <w:t xml:space="preserve">Создать потребность (приватно) или вакансию (опубликовать)</w:t>
+              <w:t xml:space="preserve">Мои потребности и вакансии</w:t>
             </w:r>
           </w:p>
         </w:tc>
@@ -40225,7 +40417,7 @@
                 <w:sz w:val="15"/>
                 <w:szCs w:val="15"/>
               </w:rPr>
-              <w:t xml:space="preserve">201, 422</w:t>
+              <w:t xml:space="preserve">200</w:t>
             </w:r>
           </w:p>
         </w:tc>
@@ -40358,7 +40550,7 @@
                 <w:sz w:val="15"/>
                 <w:szCs w:val="15"/>
               </w:rPr>
-              <w:t xml:space="preserve">/employer/vacancies/parse</w:t>
+              <w:t xml:space="preserve">/employer/vacancies</w:t>
             </w:r>
           </w:p>
         </w:tc>
@@ -40390,7 +40582,7 @@
                 <w:sz w:val="15"/>
                 <w:szCs w:val="15"/>
               </w:rPr>
-              <w:t xml:space="preserve">Разобрать текст потребности (NLP): специализация, грейд, навыки, вилка</w:t>
+              <w:t xml:space="preserve">Создать потребность (приватно) или вакансию (опубликовать)</w:t>
             </w:r>
           </w:p>
         </w:tc>
@@ -40422,7 +40614,7 @@
                 <w:sz w:val="15"/>
                 <w:szCs w:val="15"/>
               </w:rPr>
-              <w:t xml:space="preserve">200, 422</w:t>
+              <w:t xml:space="preserve">201, 422</w:t>
             </w:r>
           </w:p>
         </w:tc>
@@ -40454,7 +40646,7 @@
                 <w:sz w:val="15"/>
                 <w:szCs w:val="15"/>
               </w:rPr>
-              <w:t xml:space="preserve">нет</w:t>
+              <w:t xml:space="preserve">да</w:t>
             </w:r>
           </w:p>
         </w:tc>
@@ -40522,7 +40714,7 @@
                 <w:sz w:val="15"/>
                 <w:szCs w:val="15"/>
               </w:rPr>
-              <w:t xml:space="preserve">GET</w:t>
+              <w:t xml:space="preserve">POST</w:t>
             </w:r>
           </w:p>
         </w:tc>
@@ -40553,7 +40745,7 @@
                 <w:sz w:val="15"/>
                 <w:szCs w:val="15"/>
               </w:rPr>
-              <w:t xml:space="preserve">/employer/vacancies/{vid}</w:t>
+              <w:t xml:space="preserve">/employer/vacancies/parse</w:t>
             </w:r>
           </w:p>
         </w:tc>
@@ -40584,7 +40776,7 @@
                 <w:sz w:val="15"/>
                 <w:szCs w:val="15"/>
               </w:rPr>
-              <w:t xml:space="preserve">Потребность/вакансия</w:t>
+              <w:t xml:space="preserve">Разобрать текст потребности (NLP): специализация, грейд, навыки, вилка</w:t>
             </w:r>
           </w:p>
         </w:tc>
@@ -40646,7 +40838,7 @@
                 <w:sz w:val="15"/>
                 <w:szCs w:val="15"/>
               </w:rPr>
-              <w:t xml:space="preserve">да</w:t>
+              <w:t xml:space="preserve">нет</w:t>
             </w:r>
           </w:p>
         </w:tc>
@@ -40716,7 +40908,7 @@
                 <w:sz w:val="15"/>
                 <w:szCs w:val="15"/>
               </w:rPr>
-              <w:t xml:space="preserve">PUT</w:t>
+              <w:t xml:space="preserve">GET</w:t>
             </w:r>
           </w:p>
         </w:tc>
@@ -40780,7 +40972,7 @@
                 <w:sz w:val="15"/>
                 <w:szCs w:val="15"/>
               </w:rPr>
-              <w:t xml:space="preserve">Редактировать потребность/вакансию</w:t>
+              <w:t xml:space="preserve">Потребность/вакансия</w:t>
             </w:r>
           </w:p>
         </w:tc>
@@ -40912,7 +41104,7 @@
                 <w:sz w:val="15"/>
                 <w:szCs w:val="15"/>
               </w:rPr>
-              <w:t xml:space="preserve">GET</w:t>
+              <w:t xml:space="preserve">PUT</w:t>
             </w:r>
           </w:p>
         </w:tc>
@@ -40943,7 +41135,7 @@
                 <w:sz w:val="15"/>
                 <w:szCs w:val="15"/>
               </w:rPr>
-              <w:t xml:space="preserve">/employer/vacancies/{vid}/applications</w:t>
+              <w:t xml:space="preserve">/employer/vacancies/{vid}</w:t>
             </w:r>
           </w:p>
         </w:tc>
@@ -40974,7 +41166,7 @@
                 <w:sz w:val="15"/>
                 <w:szCs w:val="15"/>
               </w:rPr>
-              <w:t xml:space="preserve">Отклики на вакансию (с оценкой соответствия)</w:t>
+              <w:t xml:space="preserve">Редактировать потребность/вакансию</w:t>
             </w:r>
           </w:p>
         </w:tc>
@@ -41106,7 +41298,7 @@
                 <w:sz w:val="15"/>
                 <w:szCs w:val="15"/>
               </w:rPr>
-              <w:t xml:space="preserve">POST</w:t>
+              <w:t xml:space="preserve">GET</w:t>
             </w:r>
           </w:p>
         </w:tc>
@@ -41138,7 +41330,7 @@
                 <w:sz w:val="15"/>
                 <w:szCs w:val="15"/>
               </w:rPr>
-              <w:t xml:space="preserve">/employer/vacancies/{vid}/close</w:t>
+              <w:t xml:space="preserve">/employer/vacancies/{vid}/applications</w:t>
             </w:r>
           </w:p>
         </w:tc>
@@ -41170,7 +41362,7 @@
                 <w:sz w:val="15"/>
                 <w:szCs w:val="15"/>
               </w:rPr>
-              <w:t xml:space="preserve">Закрыть вакансию</w:t>
+              <w:t xml:space="preserve">Отклики на вакансию (с оценкой соответствия)</w:t>
             </w:r>
           </w:p>
         </w:tc>
@@ -41302,7 +41494,7 @@
                 <w:sz w:val="15"/>
                 <w:szCs w:val="15"/>
               </w:rPr>
-              <w:t xml:space="preserve">GET</w:t>
+              <w:t xml:space="preserve">POST</w:t>
             </w:r>
           </w:p>
         </w:tc>
@@ -41333,7 +41525,7 @@
                 <w:sz w:val="15"/>
                 <w:szCs w:val="15"/>
               </w:rPr>
-              <w:t xml:space="preserve">/employer/vacancies/{vid}/test-preview</w:t>
+              <w:t xml:space="preserve">/employer/vacancies/{vid}/close</w:t>
             </w:r>
           </w:p>
         </w:tc>
@@ -41364,7 +41556,7 @@
                 <w:sz w:val="15"/>
                 <w:szCs w:val="15"/>
               </w:rPr>
-              <w:t xml:space="preserve">Как по этой вакансии формируются задания теста</w:t>
+              <w:t xml:space="preserve">Закрыть вакансию</w:t>
             </w:r>
           </w:p>
         </w:tc>
@@ -41528,7 +41720,7 @@
                 <w:sz w:val="15"/>
                 <w:szCs w:val="15"/>
               </w:rPr>
-              <w:t xml:space="preserve">/employer/views</w:t>
+              <w:t xml:space="preserve">/employer/vacancies/{vid}/test-preview</w:t>
             </w:r>
           </w:p>
         </w:tc>
@@ -41560,7 +41752,7 @@
                 <w:sz w:val="15"/>
                 <w:szCs w:val="15"/>
               </w:rPr>
-              <w:t xml:space="preserve">Кого из кандидатов просматривали (аудит)</w:t>
+              <w:t xml:space="preserve">Как по этой вакансии формируются задания теста</w:t>
             </w:r>
           </w:p>
         </w:tc>
@@ -41592,7 +41784,7 @@
                 <w:sz w:val="15"/>
                 <w:szCs w:val="15"/>
               </w:rPr>
-              <w:t xml:space="preserve">200</w:t>
+              <w:t xml:space="preserve">200, 422</w:t>
             </w:r>
           </w:p>
         </w:tc>
@@ -41661,7 +41853,7 @@
                 <w:sz w:val="15"/>
                 <w:szCs w:val="15"/>
               </w:rPr>
-              <w:t xml:space="preserve">Интеграция с ФСП</w:t>
+              <w:t xml:space="preserve">Работодатель</w:t>
             </w:r>
           </w:p>
         </w:tc>
@@ -41723,7 +41915,7 @@
                 <w:sz w:val="15"/>
                 <w:szCs w:val="15"/>
               </w:rPr>
-              <w:t xml:space="preserve">/fsp/callback</w:t>
+              <w:t xml:space="preserve">/employer/views</w:t>
             </w:r>
           </w:p>
         </w:tc>
@@ -41754,7 +41946,7 @@
                 <w:sz w:val="15"/>
                 <w:szCs w:val="15"/>
               </w:rPr>
-              <w:t xml:space="preserve">Redirect URI для OIDC-провайдера ФСП ID</w:t>
+              <w:t xml:space="preserve">Кого из кандидатов просматривали (аудит)</w:t>
             </w:r>
           </w:p>
         </w:tc>
@@ -41785,7 +41977,7 @@
                 <w:sz w:val="15"/>
                 <w:szCs w:val="15"/>
               </w:rPr>
-              <w:t xml:space="preserve">200, 422</w:t>
+              <w:t xml:space="preserve">200</w:t>
             </w:r>
           </w:p>
         </w:tc>
@@ -41816,7 +42008,7 @@
                 <w:sz w:val="15"/>
                 <w:szCs w:val="15"/>
               </w:rPr>
-              <w:t xml:space="preserve">нет</w:t>
+              <w:t xml:space="preserve">да</w:t>
             </w:r>
           </w:p>
         </w:tc>
@@ -41886,7 +42078,7 @@
                 <w:sz w:val="15"/>
                 <w:szCs w:val="15"/>
               </w:rPr>
-              <w:t xml:space="preserve">DELETE</w:t>
+              <w:t xml:space="preserve">GET</w:t>
             </w:r>
           </w:p>
         </w:tc>
@@ -41918,7 +42110,7 @@
                 <w:sz w:val="15"/>
                 <w:szCs w:val="15"/>
               </w:rPr>
-              <w:t xml:space="preserve">/fsp/link</w:t>
+              <w:t xml:space="preserve">/fsp/callback</w:t>
             </w:r>
           </w:p>
         </w:tc>
@@ -41950,7 +42142,7 @@
                 <w:sz w:val="15"/>
                 <w:szCs w:val="15"/>
               </w:rPr>
-              <w:t xml:space="preserve">Отвязать ФСП ID</w:t>
+              <w:t xml:space="preserve">Redirect URI для OIDC-провайдера ФСП ID</w:t>
             </w:r>
           </w:p>
         </w:tc>
@@ -41982,7 +42174,7 @@
                 <w:sz w:val="15"/>
                 <w:szCs w:val="15"/>
               </w:rPr>
-              <w:t xml:space="preserve">200</w:t>
+              <w:t xml:space="preserve">200, 422</w:t>
             </w:r>
           </w:p>
         </w:tc>
@@ -42014,7 +42206,7 @@
                 <w:sz w:val="15"/>
                 <w:szCs w:val="15"/>
               </w:rPr>
-              <w:t xml:space="preserve">да</w:t>
+              <w:t xml:space="preserve">нет</w:t>
             </w:r>
           </w:p>
         </w:tc>
@@ -42082,7 +42274,7 @@
                 <w:sz w:val="15"/>
                 <w:szCs w:val="15"/>
               </w:rPr>
-              <w:t xml:space="preserve">GET</w:t>
+              <w:t xml:space="preserve">DELETE</w:t>
             </w:r>
           </w:p>
         </w:tc>
@@ -42144,7 +42336,7 @@
                 <w:sz w:val="15"/>
                 <w:szCs w:val="15"/>
               </w:rPr>
-              <w:t xml:space="preserve">Начать привязку ФСП ID (возвращает URL авторизации ФСП)</w:t>
+              <w:t xml:space="preserve">Отвязать ФСП ID</w:t>
             </w:r>
           </w:p>
         </w:tc>
@@ -42308,7 +42500,7 @@
                 <w:sz w:val="15"/>
                 <w:szCs w:val="15"/>
               </w:rPr>
-              <w:t xml:space="preserve">/fsp/login</w:t>
+              <w:t xml:space="preserve">/fsp/link</w:t>
             </w:r>
           </w:p>
         </w:tc>
@@ -42340,7 +42532,7 @@
                 <w:sz w:val="15"/>
                 <w:szCs w:val="15"/>
               </w:rPr>
-              <w:t xml:space="preserve">Начать вход через ФСП ID</w:t>
+              <w:t xml:space="preserve">Начать привязку ФСП ID (возвращает URL авторизации ФСП)</w:t>
             </w:r>
           </w:p>
         </w:tc>
@@ -42404,7 +42596,7 @@
                 <w:sz w:val="15"/>
                 <w:szCs w:val="15"/>
               </w:rPr>
-              <w:t xml:space="preserve">нет</w:t>
+              <w:t xml:space="preserve">да</w:t>
             </w:r>
           </w:p>
         </w:tc>
@@ -42472,7 +42664,7 @@
                 <w:sz w:val="15"/>
                 <w:szCs w:val="15"/>
               </w:rPr>
-              <w:t xml:space="preserve">POST</w:t>
+              <w:t xml:space="preserve">GET</w:t>
             </w:r>
           </w:p>
         </w:tc>
@@ -42503,7 +42695,7 @@
                 <w:sz w:val="15"/>
                 <w:szCs w:val="15"/>
               </w:rPr>
-              <w:t xml:space="preserve">/fsp/sync</w:t>
+              <w:t xml:space="preserve">/fsp/login</w:t>
             </w:r>
           </w:p>
         </w:tc>
@@ -42534,7 +42726,7 @@
                 <w:sz w:val="15"/>
                 <w:szCs w:val="15"/>
               </w:rPr>
-              <w:t xml:space="preserve">Обновить достижения из реестра ФСП</w:t>
+              <w:t xml:space="preserve">Начать вход через ФСП ID</w:t>
             </w:r>
           </w:p>
         </w:tc>
@@ -42565,7 +42757,7 @@
                 <w:sz w:val="15"/>
                 <w:szCs w:val="15"/>
               </w:rPr>
-              <w:t xml:space="preserve">200, 409</w:t>
+              <w:t xml:space="preserve">200</w:t>
             </w:r>
           </w:p>
         </w:tc>
@@ -42596,7 +42788,7 @@
                 <w:sz w:val="15"/>
                 <w:szCs w:val="15"/>
               </w:rPr>
-              <w:t xml:space="preserve">да</w:t>
+              <w:t xml:space="preserve">нет</w:t>
             </w:r>
           </w:p>
         </w:tc>
@@ -42634,7 +42826,7 @@
                 <w:sz w:val="15"/>
                 <w:szCs w:val="15"/>
               </w:rPr>
-              <w:t xml:space="preserve">Публичное: методика и оценка</w:t>
+              <w:t xml:space="preserve">Интеграция с ФСП</w:t>
             </w:r>
           </w:p>
         </w:tc>
@@ -42698,7 +42890,7 @@
                 <w:sz w:val="15"/>
                 <w:szCs w:val="15"/>
               </w:rPr>
-              <w:t xml:space="preserve">/eval/rank</w:t>
+              <w:t xml:space="preserve">/fsp/sync</w:t>
             </w:r>
           </w:p>
         </w:tc>
@@ -42730,7 +42922,7 @@
                 <w:sz w:val="15"/>
                 <w:szCs w:val="15"/>
               </w:rPr>
-              <w:t xml:space="preserve">Стенд оценки: ранжирование переданных кандидатов под текст вакансии</w:t>
+              <w:t xml:space="preserve">Обновить достижения из реестра ФСП</w:t>
             </w:r>
           </w:p>
         </w:tc>
@@ -42762,7 +42954,7 @@
                 <w:sz w:val="15"/>
                 <w:szCs w:val="15"/>
               </w:rPr>
-              <w:t xml:space="preserve">200, 422</w:t>
+              <w:t xml:space="preserve">200, 409</w:t>
             </w:r>
           </w:p>
         </w:tc>
@@ -42794,7 +42986,7 @@
                 <w:sz w:val="15"/>
                 <w:szCs w:val="15"/>
               </w:rPr>
-              <w:t xml:space="preserve">нет</w:t>
+              <w:t xml:space="preserve">да</w:t>
             </w:r>
           </w:p>
         </w:tc>
@@ -42862,7 +43054,7 @@
                 <w:sz w:val="15"/>
                 <w:szCs w:val="15"/>
               </w:rPr>
-              <w:t xml:space="preserve">GET</w:t>
+              <w:t xml:space="preserve">POST</w:t>
             </w:r>
           </w:p>
         </w:tc>
@@ -42893,7 +43085,7 @@
                 <w:sz w:val="15"/>
                 <w:szCs w:val="15"/>
               </w:rPr>
-              <w:t xml:space="preserve">/public/methodology</w:t>
+              <w:t xml:space="preserve">/eval/rank</w:t>
             </w:r>
           </w:p>
         </w:tc>
@@ -42924,7 +43116,7 @@
                 <w:sz w:val="15"/>
                 <w:szCs w:val="15"/>
               </w:rPr>
-              <w:t xml:space="preserve">Результаты валидации механик тестирования и подбора</w:t>
+              <w:t xml:space="preserve">Стенд оценки: ранжирование переданных кандидатов под текст вакансии</w:t>
             </w:r>
           </w:p>
         </w:tc>
@@ -42955,7 +43147,7 @@
                 <w:sz w:val="15"/>
                 <w:szCs w:val="15"/>
               </w:rPr>
-              <w:t xml:space="preserve">200</w:t>
+              <w:t xml:space="preserve">200, 422</w:t>
             </w:r>
           </w:p>
         </w:tc>
@@ -43088,7 +43280,7 @@
                 <w:sz w:val="15"/>
                 <w:szCs w:val="15"/>
               </w:rPr>
-              <w:t xml:space="preserve">/public/stats</w:t>
+              <w:t xml:space="preserve">/public/methodology</w:t>
             </w:r>
           </w:p>
         </w:tc>
@@ -43120,7 +43312,7 @@
                 <w:sz w:val="15"/>
                 <w:szCs w:val="15"/>
               </w:rPr>
-              <w:t xml:space="preserve">Статистика платформы</w:t>
+              <w:t xml:space="preserve">Результаты валидации механик тестирования и подбора</w:t>
             </w:r>
           </w:p>
         </w:tc>
@@ -43221,7 +43413,7 @@
                 <w:sz w:val="15"/>
                 <w:szCs w:val="15"/>
               </w:rPr>
-              <w:t xml:space="preserve">Администрирование</w:t>
+              <w:t xml:space="preserve">Публичное: методика и оценка</w:t>
             </w:r>
           </w:p>
         </w:tc>
@@ -43283,7 +43475,7 @@
                 <w:sz w:val="15"/>
                 <w:szCs w:val="15"/>
               </w:rPr>
-              <w:t xml:space="preserve">/admin/items</w:t>
+              <w:t xml:space="preserve">/public/stats</w:t>
             </w:r>
           </w:p>
         </w:tc>
@@ -43314,7 +43506,7 @@
                 <w:sz w:val="15"/>
                 <w:szCs w:val="15"/>
               </w:rPr>
-              <w:t xml:space="preserve">Статистика банка заданий: экспозиция и дрейф</w:t>
+              <w:t xml:space="preserve">Статистика платформы</w:t>
             </w:r>
           </w:p>
         </w:tc>
@@ -43376,7 +43568,7 @@
                 <w:sz w:val="15"/>
                 <w:szCs w:val="15"/>
               </w:rPr>
-              <w:t xml:space="preserve">да</w:t>
+              <w:t xml:space="preserve">нет</w:t>
             </w:r>
           </w:p>
         </w:tc>
@@ -43446,7 +43638,7 @@
                 <w:sz w:val="15"/>
                 <w:szCs w:val="15"/>
               </w:rPr>
-              <w:t xml:space="preserve">POST</w:t>
+              <w:t xml:space="preserve">GET</w:t>
             </w:r>
           </w:p>
         </w:tc>
@@ -43478,7 +43670,7 @@
                 <w:sz w:val="15"/>
                 <w:szCs w:val="15"/>
               </w:rPr>
-              <w:t xml:space="preserve">/admin/items/calibrate</w:t>
+              <w:t xml:space="preserve">/admin/items</w:t>
             </w:r>
           </w:p>
         </w:tc>
@@ -43510,7 +43702,7 @@
                 <w:sz w:val="15"/>
                 <w:szCs w:val="15"/>
               </w:rPr>
-              <w:t xml:space="preserve">Откалибровать пилотные задания</w:t>
+              <w:t xml:space="preserve">Статистика банка заданий: экспозиция и дрейф</w:t>
             </w:r>
           </w:p>
         </w:tc>
@@ -43611,6 +43803,199 @@
                 <w:sz w:val="15"/>
                 <w:szCs w:val="15"/>
               </w:rPr>
+              <w:t xml:space="preserve">Администрирование</w:t>
+            </w:r>
+          </w:p>
+        </w:tc>
+        <w:tc>
+          <w:tcPr>
+            <w:tcW w:type="dxa" w:w="867"/>
+            <w:tcBorders>
+              <w:top w:val="single" w:color="DDD8EA" w:sz="4"/>
+              <w:left w:val="single" w:color="DDD8EA" w:sz="4"/>
+              <w:bottom w:val="single" w:color="DDD8EA" w:sz="4"/>
+              <w:right w:val="single" w:color="DDD8EA" w:sz="4"/>
+            </w:tcBorders>
+            <w:tcMar>
+              <w:top w:type="dxa" w:w="50"/>
+              <w:left w:type="dxa" w:w="90"/>
+              <w:bottom w:type="dxa" w:w="50"/>
+              <w:right w:type="dxa" w:w="90"/>
+            </w:tcMar>
+            <w:vAlign w:val="center"/>
+          </w:tcPr>
+          <w:p>
+            <w:pPr>
+              <w:spacing w:after="0" w:line="250"/>
+            </w:pPr>
+            <w:r>
+              <w:rPr>
+                <w:color w:val="1C1D22"/>
+                <w:sz w:val="15"/>
+                <w:szCs w:val="15"/>
+              </w:rPr>
+              <w:t xml:space="preserve">POST</w:t>
+            </w:r>
+          </w:p>
+        </w:tc>
+        <w:tc>
+          <w:tcPr>
+            <w:tcW w:type="dxa" w:w="2602"/>
+            <w:tcBorders>
+              <w:top w:val="single" w:color="DDD8EA" w:sz="4"/>
+              <w:left w:val="single" w:color="DDD8EA" w:sz="4"/>
+              <w:bottom w:val="single" w:color="DDD8EA" w:sz="4"/>
+              <w:right w:val="single" w:color="DDD8EA" w:sz="4"/>
+            </w:tcBorders>
+            <w:tcMar>
+              <w:top w:type="dxa" w:w="50"/>
+              <w:left w:type="dxa" w:w="90"/>
+              <w:bottom w:type="dxa" w:w="50"/>
+              <w:right w:type="dxa" w:w="90"/>
+            </w:tcMar>
+            <w:vAlign w:val="center"/>
+          </w:tcPr>
+          <w:p>
+            <w:pPr>
+              <w:spacing w:after="0" w:line="250"/>
+            </w:pPr>
+            <w:r>
+              <w:rPr>
+                <w:color w:val="1C1D22"/>
+                <w:sz w:val="15"/>
+                <w:szCs w:val="15"/>
+              </w:rPr>
+              <w:t xml:space="preserve">/admin/items/calibrate</w:t>
+            </w:r>
+          </w:p>
+        </w:tc>
+        <w:tc>
+          <w:tcPr>
+            <w:tcW w:type="dxa" w:w="2988"/>
+            <w:tcBorders>
+              <w:top w:val="single" w:color="DDD8EA" w:sz="4"/>
+              <w:left w:val="single" w:color="DDD8EA" w:sz="4"/>
+              <w:bottom w:val="single" w:color="DDD8EA" w:sz="4"/>
+              <w:right w:val="single" w:color="DDD8EA" w:sz="4"/>
+            </w:tcBorders>
+            <w:tcMar>
+              <w:top w:type="dxa" w:w="50"/>
+              <w:left w:type="dxa" w:w="90"/>
+              <w:bottom w:type="dxa" w:w="50"/>
+              <w:right w:type="dxa" w:w="90"/>
+            </w:tcMar>
+            <w:vAlign w:val="center"/>
+          </w:tcPr>
+          <w:p>
+            <w:pPr>
+              <w:spacing w:after="0" w:line="250"/>
+            </w:pPr>
+            <w:r>
+              <w:rPr>
+                <w:color w:val="1C1D22"/>
+                <w:sz w:val="15"/>
+                <w:szCs w:val="15"/>
+              </w:rPr>
+              <w:t xml:space="preserve">Откалибровать пилотные задания</w:t>
+            </w:r>
+          </w:p>
+        </w:tc>
+        <w:tc>
+          <w:tcPr>
+            <w:tcW w:type="dxa" w:w="964"/>
+            <w:tcBorders>
+              <w:top w:val="single" w:color="DDD8EA" w:sz="4"/>
+              <w:left w:val="single" w:color="DDD8EA" w:sz="4"/>
+              <w:bottom w:val="single" w:color="DDD8EA" w:sz="4"/>
+              <w:right w:val="single" w:color="DDD8EA" w:sz="4"/>
+            </w:tcBorders>
+            <w:tcMar>
+              <w:top w:type="dxa" w:w="50"/>
+              <w:left w:type="dxa" w:w="90"/>
+              <w:bottom w:type="dxa" w:w="50"/>
+              <w:right w:type="dxa" w:w="90"/>
+            </w:tcMar>
+            <w:vAlign w:val="center"/>
+          </w:tcPr>
+          <w:p>
+            <w:pPr>
+              <w:spacing w:after="0" w:line="250"/>
+            </w:pPr>
+            <w:r>
+              <w:rPr>
+                <w:color w:val="1C1D22"/>
+                <w:sz w:val="15"/>
+                <w:szCs w:val="15"/>
+              </w:rPr>
+              <w:t xml:space="preserve">200</w:t>
+            </w:r>
+          </w:p>
+        </w:tc>
+        <w:tc>
+          <w:tcPr>
+            <w:tcW w:type="dxa" w:w="579"/>
+            <w:tcBorders>
+              <w:top w:val="single" w:color="DDD8EA" w:sz="4"/>
+              <w:left w:val="single" w:color="DDD8EA" w:sz="4"/>
+              <w:bottom w:val="single" w:color="DDD8EA" w:sz="4"/>
+              <w:right w:val="single" w:color="DDD8EA" w:sz="4"/>
+            </w:tcBorders>
+            <w:tcMar>
+              <w:top w:type="dxa" w:w="50"/>
+              <w:left w:type="dxa" w:w="90"/>
+              <w:bottom w:type="dxa" w:w="50"/>
+              <w:right w:type="dxa" w:w="90"/>
+            </w:tcMar>
+            <w:vAlign w:val="center"/>
+          </w:tcPr>
+          <w:p>
+            <w:pPr>
+              <w:spacing w:after="0" w:line="250"/>
+            </w:pPr>
+            <w:r>
+              <w:rPr>
+                <w:color w:val="1C1D22"/>
+                <w:sz w:val="15"/>
+                <w:szCs w:val="15"/>
+              </w:rPr>
+              <w:t xml:space="preserve">да</w:t>
+            </w:r>
+          </w:p>
+        </w:tc>
+      </w:tr>
+      <w:tr>
+        <w:trPr>
+          <w:cantSplit/>
+          <w:tblHeader w:val="off"/>
+        </w:trPr>
+        <w:tc>
+          <w:tcPr>
+            <w:tcW w:type="dxa" w:w="1638"/>
+            <w:tcBorders>
+              <w:top w:val="single" w:color="DDD8EA" w:sz="4"/>
+              <w:left w:val="single" w:color="DDD8EA" w:sz="4"/>
+              <w:bottom w:val="single" w:color="DDD8EA" w:sz="4"/>
+              <w:right w:val="single" w:color="DDD8EA" w:sz="4"/>
+            </w:tcBorders>
+            <w:shd w:fill="F6F4FA" w:color="auto" w:val="clear"/>
+            <w:tcMar>
+              <w:top w:type="dxa" w:w="50"/>
+              <w:left w:type="dxa" w:w="90"/>
+              <w:bottom w:type="dxa" w:w="50"/>
+              <w:right w:type="dxa" w:w="90"/>
+            </w:tcMar>
+            <w:vAlign w:val="center"/>
+          </w:tcPr>
+          <w:p>
+            <w:pPr>
+              <w:spacing w:after="0" w:line="250"/>
+            </w:pPr>
+            <w:r>
+              <w:rPr>
+                <w:color w:val="1C1D22"/>
+                <w:sz w:val="15"/>
+                <w:szCs w:val="15"/>
+              </w:rPr>
               <w:t xml:space="preserve">Служебное</w:t>
             </w:r>
           </w:p>
@@ -43624,6 +44009,7 @@
               <w:bottom w:val="single" w:color="DDD8EA" w:sz="4"/>
               <w:right w:val="single" w:color="DDD8EA" w:sz="4"/>
             </w:tcBorders>
+            <w:shd w:fill="F6F4FA" w:color="auto" w:val="clear"/>
             <w:tcMar>
               <w:top w:type="dxa" w:w="50"/>
               <w:left w:type="dxa" w:w="90"/>
@@ -43655,6 +44041,7 @@
               <w:bottom w:val="single" w:color="DDD8EA" w:sz="4"/>
               <w:right w:val="single" w:color="DDD8EA" w:sz="4"/>
             </w:tcBorders>
+            <w:shd w:fill="F6F4FA" w:color="auto" w:val="clear"/>
             <w:tcMar>
               <w:top w:type="dxa" w:w="50"/>
               <w:left w:type="dxa" w:w="90"/>
@@ -43686,6 +44073,7 @@
               <w:bottom w:val="single" w:color="DDD8EA" w:sz="4"/>
               <w:right w:val="single" w:color="DDD8EA" w:sz="4"/>
             </w:tcBorders>
+            <w:shd w:fill="F6F4FA" w:color="auto" w:val="clear"/>
             <w:tcMar>
               <w:top w:type="dxa" w:w="50"/>
               <w:left w:type="dxa" w:w="90"/>
@@ -43717,6 +44105,7 @@
               <w:bottom w:val="single" w:color="DDD8EA" w:sz="4"/>
               <w:right w:val="single" w:color="DDD8EA" w:sz="4"/>
             </w:tcBorders>
+            <w:shd w:fill="F6F4FA" w:color="auto" w:val="clear"/>
             <w:tcMar>
               <w:top w:type="dxa" w:w="50"/>
               <w:left w:type="dxa" w:w="90"/>
@@ -43748,6 +44137,7 @@
               <w:bottom w:val="single" w:color="DDD8EA" w:sz="4"/>
               <w:right w:val="single" w:color="DDD8EA" w:sz="4"/>
             </w:tcBorders>
+            <w:shd w:fill="F6F4FA" w:color="auto" w:val="clear"/>
             <w:tcMar>
               <w:top w:type="dxa" w:w="50"/>
               <w:left w:type="dxa" w:w="90"/>
@@ -51371,7 +51761,7 @@
           <w:sz w:val="20"/>
           <w:szCs w:val="20"/>
         </w:rPr>
-        <w:t xml:space="preserve"> — 495 тестов: банк заданий (корректность всех генераторов и ключей), сквозной сценарий кандидата и работодателя, правила видимости, несколько резюме и категорий, прокторинг и штраф, время по трудности, PDF, разбор резюме hh.ru.</w:t>
+        <w:t xml:space="preserve"> — 496 тестов: банк заданий (корректность всех генераторов и ключей), сквозной сценарий кандидата и работодателя, правила видимости, несколько резюме и категорий, прокторинг и штраф, принятие грейда ниже по тому же тесту, время по трудности, PDF, разбор резюме hh.ru.</w:t>
       </w:r>
     </w:p>
     <w:p>

</xml_diff>

<commit_message>
Monthly grade-change limit; next-level test only on the candidate's confirmation
- Grade change and same-level retake: once a month (30 days instead of 90).
- A strong result no longer pushes the next-level test: it becomes available
  without the monthly wait, with no deadline, and is a single attempt; the
  candidate starts it whenever ready.
- Every test start requires a readiness confirmation (duration, proctoring rules,
  retake limits, "I'm ready" checkbox); the result page shows a calm
  "next level when you're ready" card instead of a "start now" button.
- Docs, README, methodology page and presentation updated; new e2e test.
</commit_message>
<xml_diff>
--- a/docs/fsp-career-documentation.docx
+++ b/docs/fsp-career-documentation.docx
@@ -3495,7 +3495,7 @@
                 <w:sz w:val="17"/>
                 <w:szCs w:val="17"/>
               </w:rPr>
-              <w:t xml:space="preserve">Не подтвердил — сразу доступен тест уровнем ниже; подтвердил уверенно — уровнем выше; смена грейда не чаще раза в 90 дней, повтор уровня — через 30 дней</w:t>
+              <w:t xml:space="preserve">Не подтвердил — грейд ниже по тому же тесту или тест уровнем ниже без ожидания; подтвердил уверенно — тест уровнем выше без ожидания, когда кандидат подтвердит готовность; смена грейда и повтор уровня — не чаще раза в месяц</w:t>
             </w:r>
           </w:p>
         </w:tc>
@@ -6716,7 +6716,7 @@
           <w:sz w:val="20"/>
           <w:szCs w:val="20"/>
         </w:rPr>
-        <w:t xml:space="preserve">Регистрация → подтверждение e-mail → профиль (вручную или из PDF) → опрос → тест на выбранный грейд → решение по грейду. Если грейд подтверждён, кандидат получает категорию и попадает в банк кандидатов (при согласии на публикацию профиля и включённой видимости). Если не подтверждён, сразу доступен тест уровнем ниже; прежний грейд, если он был, сохраняется. После присвоения категории кандидат получает приглашения, может откликаться на вакансии и раз в неделю получает регулярное задание.</w:t>
+        <w:t xml:space="preserve">Регистрация → подтверждение e-mail → профиль (вручную или из PDF) → опрос → тест на выбранный грейд → решение по грейду. Если грейд подтверждён, кандидат получает категорию и попадает в банк кандидатов (при согласии на публикацию профиля и включённой видимости). Если не подтверждён, грейд ниже можно принять по тому же тесту (если тест уверенно его показал) или пройти тест уровнем ниже; прежний грейд, если он был, сохраняется. Любой тест кандидат начинает сам, подтвердив готовность. После присвоения категории кандидат получает приглашения, может откликаться на вакансии и раз в неделю получает регулярное задание.</w:t>
       </w:r>
     </w:p>
     <w:p>
@@ -12634,9 +12634,9 @@
         </w:tblBorders>
       </w:tblPr>
       <w:tblGrid>
-        <w:gridCol w:w="2071"/>
-        <w:gridCol w:w="2441"/>
-        <w:gridCol w:w="5126"/>
+        <w:gridCol w:w="2003"/>
+        <w:gridCol w:w="2361"/>
+        <w:gridCol w:w="5274"/>
       </w:tblGrid>
       <w:tr>
         <w:trPr>
@@ -12645,7 +12645,7 @@
         </w:trPr>
         <w:tc>
           <w:tcPr>
-            <w:tcW w:type="dxa" w:w="2071"/>
+            <w:tcW w:type="dxa" w:w="2003"/>
             <w:tcBorders>
               <w:top w:val="single" w:color="DDD8EA" w:sz="4"/>
               <w:left w:val="single" w:color="DDD8EA" w:sz="4"/>
@@ -12679,7 +12679,7 @@
         </w:tc>
         <w:tc>
           <w:tcPr>
-            <w:tcW w:type="dxa" w:w="2441"/>
+            <w:tcW w:type="dxa" w:w="2361"/>
             <w:tcBorders>
               <w:top w:val="single" w:color="DDD8EA" w:sz="4"/>
               <w:left w:val="single" w:color="DDD8EA" w:sz="4"/>
@@ -12713,7 +12713,7 @@
         </w:tc>
         <w:tc>
           <w:tcPr>
-            <w:tcW w:type="dxa" w:w="5126"/>
+            <w:tcW w:type="dxa" w:w="5274"/>
             <w:tcBorders>
               <w:top w:val="single" w:color="DDD8EA" w:sz="4"/>
               <w:left w:val="single" w:color="DDD8EA" w:sz="4"/>
@@ -12753,7 +12753,7 @@
         </w:trPr>
         <w:tc>
           <w:tcPr>
-            <w:tcW w:type="dxa" w:w="2071"/>
+            <w:tcW w:type="dxa" w:w="2003"/>
             <w:tcBorders>
               <w:top w:val="single" w:color="DDD8EA" w:sz="4"/>
               <w:left w:val="single" w:color="DDD8EA" w:sz="4"/>
@@ -12784,7 +12784,7 @@
         </w:tc>
         <w:tc>
           <w:tcPr>
-            <w:tcW w:type="dxa" w:w="2441"/>
+            <w:tcW w:type="dxa" w:w="2361"/>
             <w:tcBorders>
               <w:top w:val="single" w:color="DDD8EA" w:sz="4"/>
               <w:left w:val="single" w:color="DDD8EA" w:sz="4"/>
@@ -12815,7 +12815,7 @@
         </w:tc>
         <w:tc>
           <w:tcPr>
-            <w:tcW w:type="dxa" w:w="5126"/>
+            <w:tcW w:type="dxa" w:w="5274"/>
             <w:tcBorders>
               <w:top w:val="single" w:color="DDD8EA" w:sz="4"/>
               <w:left w:val="single" w:color="DDD8EA" w:sz="4"/>
@@ -12852,7 +12852,7 @@
         </w:trPr>
         <w:tc>
           <w:tcPr>
-            <w:tcW w:type="dxa" w:w="2071"/>
+            <w:tcW w:type="dxa" w:w="2003"/>
             <w:tcBorders>
               <w:top w:val="single" w:color="DDD8EA" w:sz="4"/>
               <w:left w:val="single" w:color="DDD8EA" w:sz="4"/>
@@ -12884,7 +12884,7 @@
         </w:tc>
         <w:tc>
           <w:tcPr>
-            <w:tcW w:type="dxa" w:w="2441"/>
+            <w:tcW w:type="dxa" w:w="2361"/>
             <w:tcBorders>
               <w:top w:val="single" w:color="DDD8EA" w:sz="4"/>
               <w:left w:val="single" w:color="DDD8EA" w:sz="4"/>
@@ -12916,7 +12916,7 @@
         </w:tc>
         <w:tc>
           <w:tcPr>
-            <w:tcW w:type="dxa" w:w="5126"/>
+            <w:tcW w:type="dxa" w:w="5274"/>
             <w:tcBorders>
               <w:top w:val="single" w:color="DDD8EA" w:sz="4"/>
               <w:left w:val="single" w:color="DDD8EA" w:sz="4"/>
@@ -12954,7 +12954,7 @@
         </w:trPr>
         <w:tc>
           <w:tcPr>
-            <w:tcW w:type="dxa" w:w="2071"/>
+            <w:tcW w:type="dxa" w:w="2003"/>
             <w:tcBorders>
               <w:top w:val="single" w:color="DDD8EA" w:sz="4"/>
               <w:left w:val="single" w:color="DDD8EA" w:sz="4"/>
@@ -12985,7 +12985,7 @@
         </w:tc>
         <w:tc>
           <w:tcPr>
-            <w:tcW w:type="dxa" w:w="2441"/>
+            <w:tcW w:type="dxa" w:w="2361"/>
             <w:tcBorders>
               <w:top w:val="single" w:color="DDD8EA" w:sz="4"/>
               <w:left w:val="single" w:color="DDD8EA" w:sz="4"/>
@@ -13016,7 +13016,7 @@
         </w:tc>
         <w:tc>
           <w:tcPr>
-            <w:tcW w:type="dxa" w:w="5126"/>
+            <w:tcW w:type="dxa" w:w="5274"/>
             <w:tcBorders>
               <w:top w:val="single" w:color="DDD8EA" w:sz="4"/>
               <w:left w:val="single" w:color="DDD8EA" w:sz="4"/>
@@ -13053,7 +13053,7 @@
         </w:trPr>
         <w:tc>
           <w:tcPr>
-            <w:tcW w:type="dxa" w:w="2071"/>
+            <w:tcW w:type="dxa" w:w="2003"/>
             <w:tcBorders>
               <w:top w:val="single" w:color="DDD8EA" w:sz="4"/>
               <w:left w:val="single" w:color="DDD8EA" w:sz="4"/>
@@ -13085,7 +13085,7 @@
         </w:tc>
         <w:tc>
           <w:tcPr>
-            <w:tcW w:type="dxa" w:w="2441"/>
+            <w:tcW w:type="dxa" w:w="2361"/>
             <w:tcBorders>
               <w:top w:val="single" w:color="DDD8EA" w:sz="4"/>
               <w:left w:val="single" w:color="DDD8EA" w:sz="4"/>
@@ -13117,7 +13117,7 @@
         </w:tc>
         <w:tc>
           <w:tcPr>
-            <w:tcW w:type="dxa" w:w="5126"/>
+            <w:tcW w:type="dxa" w:w="5274"/>
             <w:tcBorders>
               <w:top w:val="single" w:color="DDD8EA" w:sz="4"/>
               <w:left w:val="single" w:color="DDD8EA" w:sz="4"/>
@@ -13155,7 +13155,7 @@
         </w:trPr>
         <w:tc>
           <w:tcPr>
-            <w:tcW w:type="dxa" w:w="2071"/>
+            <w:tcW w:type="dxa" w:w="2003"/>
             <w:tcBorders>
               <w:top w:val="single" w:color="DDD8EA" w:sz="4"/>
               <w:left w:val="single" w:color="DDD8EA" w:sz="4"/>
@@ -13186,7 +13186,7 @@
         </w:tc>
         <w:tc>
           <w:tcPr>
-            <w:tcW w:type="dxa" w:w="2441"/>
+            <w:tcW w:type="dxa" w:w="2361"/>
             <w:tcBorders>
               <w:top w:val="single" w:color="DDD8EA" w:sz="4"/>
               <w:left w:val="single" w:color="DDD8EA" w:sz="4"/>
@@ -13217,7 +13217,7 @@
         </w:tc>
         <w:tc>
           <w:tcPr>
-            <w:tcW w:type="dxa" w:w="5126"/>
+            <w:tcW w:type="dxa" w:w="5274"/>
             <w:tcBorders>
               <w:top w:val="single" w:color="DDD8EA" w:sz="4"/>
               <w:left w:val="single" w:color="DDD8EA" w:sz="4"/>
@@ -13254,7 +13254,7 @@
         </w:trPr>
         <w:tc>
           <w:tcPr>
-            <w:tcW w:type="dxa" w:w="2071"/>
+            <w:tcW w:type="dxa" w:w="2003"/>
             <w:tcBorders>
               <w:top w:val="single" w:color="DDD8EA" w:sz="4"/>
               <w:left w:val="single" w:color="DDD8EA" w:sz="4"/>
@@ -13286,7 +13286,7 @@
         </w:tc>
         <w:tc>
           <w:tcPr>
-            <w:tcW w:type="dxa" w:w="2441"/>
+            <w:tcW w:type="dxa" w:w="2361"/>
             <w:tcBorders>
               <w:top w:val="single" w:color="DDD8EA" w:sz="4"/>
               <w:left w:val="single" w:color="DDD8EA" w:sz="4"/>
@@ -13318,7 +13318,7 @@
         </w:tc>
         <w:tc>
           <w:tcPr>
-            <w:tcW w:type="dxa" w:w="5126"/>
+            <w:tcW w:type="dxa" w:w="5274"/>
             <w:tcBorders>
               <w:top w:val="single" w:color="DDD8EA" w:sz="4"/>
               <w:left w:val="single" w:color="DDD8EA" w:sz="4"/>
@@ -13344,7 +13344,7 @@
                 <w:sz w:val="17"/>
                 <w:szCs w:val="17"/>
               </w:rPr>
-              <w:t xml:space="preserve">сразу открывается тест уровнем выше</w:t>
+              <w:t xml:space="preserve">тест уровнем выше доступен без месячного ожидания — кандидат начинает его, когда готов</w:t>
             </w:r>
           </w:p>
         </w:tc>
@@ -13387,7 +13387,7 @@
           <w:sz w:val="20"/>
           <w:szCs w:val="20"/>
         </w:rPr>
-        <w:t xml:space="preserve">По итогам теста выносится одно из трёх решений: «подтверждён», «подтверждён уверенно» (с предложением теста уровнем выше в течение 7 дней) или «пока не подтверждён». Правила, следующие из ТЗ:</w:t>
+        <w:t xml:space="preserve">По итогам теста выносится одно из трёх решений: «подтверждён», «подтверждён уверенно» (тест уровнем выше становится доступен без ожидания) или «пока не подтверждён». Правила, следующие из ТЗ:</w:t>
       </w:r>
     </w:p>
     <w:p>
@@ -13477,7 +13477,7 @@
           <w:sz w:val="20"/>
           <w:szCs w:val="20"/>
         </w:rPr>
-        <w:t xml:space="preserve"> грейд по тому же тесту нельзя: если бы «уверенный» результат сразу давал следующий грейд, он был бы верен лишь в 73% случаев (ошибка «завысили» дороже для работодателя), поэтому следующий уровень подтверждается отдельным тестом — он открывается сразу, без ожидания;</w:t>
+        <w:t xml:space="preserve"> грейд по тому же тесту нельзя: если бы «уверенный» результат сразу давал следующий грейд, он был бы верен лишь в 73% случаев (ошибка «завысили» дороже для работодателя), поэтому следующий уровень подтверждается отдельным тестом, который кандидат начинает, когда сам будет готов;</w:t>
       </w:r>
     </w:p>
     <w:p>
@@ -13495,7 +13495,43 @@
           <w:sz w:val="20"/>
           <w:szCs w:val="20"/>
         </w:rPr>
-        <w:t xml:space="preserve">смена грейда — не чаще одного раза в 90 дней; повторная попытка того же уровня — через 30 дней; уверенно подтвердивший уровень может сразу пробовать следующий;</w:t>
+        <w:t xml:space="preserve">смена грейда — не чаще одного раза в месяц (30 дней; ТЗ оставляет интервал на выбор команды — месяц защищает от перебора попыток и не тормозит рост); повторная попытка того же уровня — тоже через месяц;</w:t>
+      </w:r>
+    </w:p>
+    <w:p>
+      <w:pPr>
+        <w:pStyle w:val="ListParagraph"/>
+        <w:numPr>
+          <w:ilvl w:val="0"/>
+          <w:numId w:val="2"/>
+        </w:numPr>
+        <w:spacing w:after="70" w:line="280"/>
+      </w:pPr>
+      <w:r>
+        <w:rPr>
+          <w:color w:val="1C1D22"/>
+          <w:sz w:val="20"/>
+          <w:szCs w:val="20"/>
+        </w:rPr>
+        <w:t xml:space="preserve">уверенно подтвердившему уровень тест следующего уровня доступен без месячного ожидания, но не начинается сам: кандидат запускает его, когда будет готов, — срока нет, это одна попытка, после неё действуют обычные ограничения;</w:t>
+      </w:r>
+    </w:p>
+    <w:p>
+      <w:pPr>
+        <w:pStyle w:val="ListParagraph"/>
+        <w:numPr>
+          <w:ilvl w:val="0"/>
+          <w:numId w:val="2"/>
+        </w:numPr>
+        <w:spacing w:after="70" w:line="280"/>
+      </w:pPr>
+      <w:r>
+        <w:rPr>
+          <w:color w:val="1C1D22"/>
+          <w:sz w:val="20"/>
+          <w:szCs w:val="20"/>
+        </w:rPr>
+        <w:t xml:space="preserve">любой тест начинается только после подтверждения готовности: кандидат видит длительность, правила прокторинга и ограничения частоты и отмечает «Я готов(а)»;</w:t>
       </w:r>
     </w:p>
     <w:p>
@@ -51761,7 +51797,7 @@
           <w:sz w:val="20"/>
           <w:szCs w:val="20"/>
         </w:rPr>
-        <w:t xml:space="preserve"> — 496 тестов: банк заданий (корректность всех генераторов и ключей), сквозной сценарий кандидата и работодателя, правила видимости, несколько резюме и категорий, прокторинг и штраф, принятие грейда ниже по тому же тесту, время по трудности, PDF, разбор резюме hh.ru.</w:t>
+        <w:t xml:space="preserve"> — 497 тестов: банк заданий (корректность всех генераторов и ключей), сквозной сценарий кандидата и работодателя, правила видимости, несколько резюме и категорий, прокторинг и штраф, принятие грейда ниже по тому же тесту, повышение по готовности, время по трудности, PDF, разбор резюме hh.ru.</w:t>
       </w:r>
     </w:p>
     <w:p>

</xml_diff>